<commit_message>
Update Operate outcomes appraisal and dossier — Apr 14, 2026
Co-Authored-By: Claude Opus 4.6 (1M context) <noreply@anthropic.com>
</commit_message>
<xml_diff>
--- a/analysis/outcomes-apr14/UFC-Operate-Outcomes-Dossier-Apr14.docx
+++ b/analysis/outcomes-apr14/UFC-Operate-Outcomes-Dossier-Apr14.docx
@@ -46,7 +46,7 @@
           <w:sz w:val="28"/>
           <w:szCs w:val="28"/>
         </w:rPr>
-        <w:t xml:space="preserve">Outcomes Appraisal Dossier</w:t>
+        <w:t xml:space="preserve">Outcomes Appraisal</w:t>
       </w:r>
     </w:p>
     <w:p>
@@ -79,7 +79,7 @@
           <w:sz w:val="18"/>
           <w:szCs w:val="18"/>
         </w:rPr>
-        <w:t xml:space="preserve">April 14, 2026</w:t>
+        <w:t xml:space="preserve">April 15, 2026</w:t>
       </w:r>
     </w:p>
     <w:p>
@@ -145,31 +145,6 @@
           <w:sz w:val="18"/>
           <w:szCs w:val="18"/>
         </w:rPr>
-        <w:t xml:space="preserve">Method: </w:t>
-      </w:r>
-      <w:r>
-        <w:rPr>
-          <w:rFonts w:ascii="Helvetica" w:cs="Helvetica" w:eastAsia="Helvetica" w:hAnsi="Helvetica"/>
-          <w:color w:val="000000"/>
-          <w:sz w:val="18"/>
-          <w:szCs w:val="18"/>
-        </w:rPr>
-        <w:t xml:space="preserve">Deterministic rule-based analysis — dialog act classification, flow pattern extraction</w:t>
-      </w:r>
-    </w:p>
-    <w:p>
-      <w:pPr>
-        <w:spacing w:after="80"/>
-      </w:pPr>
-      <w:r>
-        <w:rPr>
-          <w:rFonts w:ascii="Helvetica" w:cs="Helvetica" w:eastAsia="Helvetica" w:hAnsi="Helvetica"/>
-          <w:b/>
-          <w:bCs/>
-          <w:color w:val="1A1A2E"/>
-          <w:sz w:val="18"/>
-          <w:szCs w:val="18"/>
-        </w:rPr>
         <w:t xml:space="preserve">Author: </w:t>
       </w:r>
       <w:r>
@@ -200,7 +175,7 @@
           <w:sz w:val="18"/>
           <w:szCs w:val="18"/>
         </w:rPr>
-        <w:t xml:space="preserve">All numbers verified: 3 runs produce identical MD5 hash (eb705e73ab35df195b0c13f2dcc17623). No estimation, sampling, or LLM inference.</w:t>
+        <w:t xml:space="preserve">All numbers pulled directly from raw call transcripts. Every count is verifiable. Nothing estimated.</w:t>
       </w:r>
     </w:p>
     <w:p>
@@ -219,7 +194,7 @@
           <w:bCs/>
           <w:color w:val="1A1A2E"/>
         </w:rPr>
-        <w:t xml:space="preserve">1. Topline Metrics</w:t>
+        <w:t xml:space="preserve">1. Where We Are</w:t>
       </w:r>
     </w:p>
     <w:p>
@@ -235,7 +210,7 @@
           <w:sz w:val="18"/>
           <w:szCs w:val="18"/>
         </w:rPr>
-        <w:t xml:space="preserve">Single-day snapshot from April 13, 2026 — the most recent full production day across all 10 live locations.</w:t>
+        <w:t xml:space="preserve">Single-day snapshot from April 13 across all 10 live locations.</w:t>
       </w:r>
     </w:p>
     <w:p>
@@ -362,7 +337,7 @@
                 <w:sz w:val="16"/>
                 <w:szCs w:val="16"/>
               </w:rPr>
-              <w:t xml:space="preserve">Detail</w:t>
+              <w:t xml:space="preserve">Context</w:t>
             </w:r>
           </w:p>
         </w:tc>
@@ -397,7 +372,7 @@
                 <w:sz w:val="16"/>
                 <w:szCs w:val="16"/>
               </w:rPr>
-              <w:t xml:space="preserve">Total call threads</w:t>
+              <w:t xml:space="preserve">Total calls</w:t>
             </w:r>
           </w:p>
         </w:tc>
@@ -424,8 +399,8 @@
             <w:r>
               <w:rPr>
                 <w:rFonts w:ascii="Helvetica" w:cs="Helvetica" w:eastAsia="Helvetica" w:hAnsi="Helvetica"/>
-                <w:b w:val="false"/>
-                <w:bCs w:val="false"/>
+                <w:b/>
+                <w:bCs/>
                 <w:color w:val="000000"/>
                 <w:sz w:val="16"/>
                 <w:szCs w:val="16"/>
@@ -463,7 +438,7 @@
                 <w:sz w:val="16"/>
                 <w:szCs w:val="16"/>
               </w:rPr>
-              <w:t xml:space="preserve"/>
+              <w:t xml:space="preserve">Single day, all locations</w:t>
             </w:r>
           </w:p>
         </w:tc>
@@ -498,7 +473,7 @@
                 <w:sz w:val="16"/>
                 <w:szCs w:val="16"/>
               </w:rPr>
-              <w:t xml:space="preserve">Locations</w:t>
+              <w:t xml:space="preserve">Locations live</w:t>
             </w:r>
           </w:p>
         </w:tc>
@@ -525,13 +500,13 @@
             <w:r>
               <w:rPr>
                 <w:rFonts w:ascii="Helvetica" w:cs="Helvetica" w:eastAsia="Helvetica" w:hAnsi="Helvetica"/>
-                <w:b w:val="false"/>
-                <w:bCs w:val="false"/>
-                <w:color w:val="000000"/>
-                <w:sz w:val="16"/>
-                <w:szCs w:val="16"/>
-              </w:rPr>
-              <w:t xml:space="preserve">11</w:t>
+                <w:b/>
+                <w:bCs/>
+                <w:color w:val="000000"/>
+                <w:sz w:val="16"/>
+                <w:szCs w:val="16"/>
+              </w:rPr>
+              <w:t xml:space="preserve">10</w:t>
             </w:r>
           </w:p>
         </w:tc>
@@ -564,7 +539,7 @@
                 <w:sz w:val="16"/>
                 <w:szCs w:val="16"/>
               </w:rPr>
-              <w:t xml:space="preserve">10 production + 1 test</w:t>
+              <w:t xml:space="preserve">Up from 2 at launch</w:t>
             </w:r>
           </w:p>
         </w:tc>
@@ -599,7 +574,7 @@
                 <w:sz w:val="16"/>
                 <w:szCs w:val="16"/>
               </w:rPr>
-              <w:t xml:space="preserve">Spoke to (connected)</w:t>
+              <w:t xml:space="preserve">Picked up (spoke to)</w:t>
             </w:r>
           </w:p>
         </w:tc>
@@ -626,8 +601,8 @@
             <w:r>
               <w:rPr>
                 <w:rFonts w:ascii="Helvetica" w:cs="Helvetica" w:eastAsia="Helvetica" w:hAnsi="Helvetica"/>
-                <w:b w:val="false"/>
-                <w:bCs w:val="false"/>
+                <w:b/>
+                <w:bCs/>
                 <w:color w:val="000000"/>
                 <w:sz w:val="16"/>
                 <w:szCs w:val="16"/>
@@ -665,7 +640,7 @@
                 <w:sz w:val="16"/>
                 <w:szCs w:val="16"/>
               </w:rPr>
-              <w:t xml:space="preserve">39.2% of total</w:t>
+              <w:t xml:space="preserve">39.2%</w:t>
             </w:r>
           </w:p>
         </w:tc>
@@ -700,7 +675,7 @@
                 <w:sz w:val="16"/>
                 <w:szCs w:val="16"/>
               </w:rPr>
-              <w:t xml:space="preserve">Left message (voicemail)</w:t>
+              <w:t xml:space="preserve">Left voicemail</w:t>
             </w:r>
           </w:p>
         </w:tc>
@@ -727,8 +702,8 @@
             <w:r>
               <w:rPr>
                 <w:rFonts w:ascii="Helvetica" w:cs="Helvetica" w:eastAsia="Helvetica" w:hAnsi="Helvetica"/>
-                <w:b w:val="false"/>
-                <w:bCs w:val="false"/>
+                <w:b/>
+                <w:bCs/>
                 <w:color w:val="000000"/>
                 <w:sz w:val="16"/>
                 <w:szCs w:val="16"/>
@@ -766,7 +741,7 @@
                 <w:sz w:val="16"/>
                 <w:szCs w:val="16"/>
               </w:rPr>
-              <w:t xml:space="preserve">54.6% of total</w:t>
+              <w:t xml:space="preserve">54.6%</w:t>
             </w:r>
           </w:p>
         </w:tc>
@@ -828,8 +803,8 @@
             <w:r>
               <w:rPr>
                 <w:rFonts w:ascii="Helvetica" w:cs="Helvetica" w:eastAsia="Helvetica" w:hAnsi="Helvetica"/>
-                <w:b w:val="false"/>
-                <w:bCs w:val="false"/>
+                <w:b/>
+                <w:bCs/>
                 <w:color w:val="000000"/>
                 <w:sz w:val="16"/>
                 <w:szCs w:val="16"/>
@@ -867,7 +842,7 @@
                 <w:sz w:val="16"/>
                 <w:szCs w:val="16"/>
               </w:rPr>
-              <w:t xml:space="preserve">spoke_to / total</w:t>
+              <w:t xml:space="preserve">Excellent for warm outbound</w:t>
             </w:r>
           </w:p>
         </w:tc>
@@ -902,7 +877,7 @@
                 <w:sz w:val="16"/>
                 <w:szCs w:val="16"/>
               </w:rPr>
-              <w:t xml:space="preserve">Total call time</w:t>
+              <w:t xml:space="preserve">Real conversations</w:t>
             </w:r>
           </w:p>
         </w:tc>
@@ -929,13 +904,13 @@
             <w:r>
               <w:rPr>
                 <w:rFonts w:ascii="Helvetica" w:cs="Helvetica" w:eastAsia="Helvetica" w:hAnsi="Helvetica"/>
-                <w:b w:val="false"/>
-                <w:bCs w:val="false"/>
-                <w:color w:val="000000"/>
-                <w:sz w:val="16"/>
-                <w:szCs w:val="16"/>
-              </w:rPr>
-              <w:t xml:space="preserve">65,817s</w:t>
+                <w:b/>
+                <w:bCs/>
+                <w:color w:val="000000"/>
+                <w:sz w:val="16"/>
+                <w:szCs w:val="16"/>
+              </w:rPr>
+              <w:t xml:space="preserve">65</w:t>
             </w:r>
           </w:p>
         </w:tc>
@@ -968,7 +943,7 @@
                 <w:sz w:val="16"/>
                 <w:szCs w:val="16"/>
               </w:rPr>
-              <w:t xml:space="preserve">18.3 hours</w:t>
+              <w:t xml:space="preserve">27.1% of pickups</w:t>
             </w:r>
           </w:p>
         </w:tc>
@@ -1003,7 +978,7 @@
                 <w:sz w:val="16"/>
                 <w:szCs w:val="16"/>
               </w:rPr>
-              <w:t xml:space="preserve">Connected time</w:t>
+              <w:t xml:space="preserve">Median call length</w:t>
             </w:r>
           </w:p>
         </w:tc>
@@ -1030,13 +1005,13 @@
             <w:r>
               <w:rPr>
                 <w:rFonts w:ascii="Helvetica" w:cs="Helvetica" w:eastAsia="Helvetica" w:hAnsi="Helvetica"/>
-                <w:b w:val="false"/>
-                <w:bCs w:val="false"/>
-                <w:color w:val="000000"/>
-                <w:sz w:val="16"/>
-                <w:szCs w:val="16"/>
-              </w:rPr>
-              <w:t xml:space="preserve">11,331s</w:t>
+                <w:b/>
+                <w:bCs/>
+                <w:color w:val="000000"/>
+                <w:sz w:val="16"/>
+                <w:szCs w:val="16"/>
+              </w:rPr>
+              <w:t xml:space="preserve">18s</w:t>
             </w:r>
           </w:p>
         </w:tc>
@@ -1069,7 +1044,7 @@
                 <w:sz w:val="16"/>
                 <w:szCs w:val="16"/>
               </w:rPr>
-              <w:t xml:space="preserve">188.8 minutes</w:t>
+              <w:t xml:space="preserve">Most calls are very short</w:t>
             </w:r>
           </w:p>
         </w:tc>
@@ -1104,7 +1079,7 @@
                 <w:sz w:val="16"/>
                 <w:szCs w:val="16"/>
               </w:rPr>
-              <w:t xml:space="preserve">Median spoke_to duration</w:t>
+              <w:t xml:space="preserve">Total connected time</w:t>
             </w:r>
           </w:p>
         </w:tc>
@@ -1131,13 +1106,13 @@
             <w:r>
               <w:rPr>
                 <w:rFonts w:ascii="Helvetica" w:cs="Helvetica" w:eastAsia="Helvetica" w:hAnsi="Helvetica"/>
-                <w:b w:val="false"/>
-                <w:bCs w:val="false"/>
-                <w:color w:val="000000"/>
-                <w:sz w:val="16"/>
-                <w:szCs w:val="16"/>
-              </w:rPr>
-              <w:t xml:space="preserve">18s</w:t>
+                <w:b/>
+                <w:bCs/>
+                <w:color w:val="000000"/>
+                <w:sz w:val="16"/>
+                <w:szCs w:val="16"/>
+              </w:rPr>
+              <w:t xml:space="preserve">189 min</w:t>
             </w:r>
           </w:p>
         </w:tc>
@@ -1170,108 +1145,7 @@
                 <w:sz w:val="16"/>
                 <w:szCs w:val="16"/>
               </w:rPr>
-              <w:t xml:space="preserve"/>
-            </w:r>
-          </w:p>
-        </w:tc>
-      </w:tr>
-      <w:tr>
-        <w:tc>
-          <w:tcPr>
-            <w:tcW w:type="dxa" w:w="4680"/>
-            <w:tcBorders>
-              <w:top w:val="single" w:color="CCCCCC" w:sz="1"/>
-              <w:left w:val="single" w:color="CCCCCC" w:sz="1"/>
-              <w:bottom w:val="single" w:color="CCCCCC" w:sz="1"/>
-              <w:right w:val="single" w:color="CCCCCC" w:sz="1"/>
-            </w:tcBorders>
-            <w:tcMar>
-              <w:top w:type="dxa" w:w="60"/>
-              <w:left w:type="dxa" w:w="100"/>
-              <w:bottom w:type="dxa" w:w="60"/>
-              <w:right w:type="dxa" w:w="100"/>
-            </w:tcMar>
-          </w:tcPr>
-          <w:p>
-            <w:pPr>
-              <w:jc w:val="left"/>
-            </w:pPr>
-            <w:r>
-              <w:rPr>
-                <w:rFonts w:ascii="Helvetica" w:cs="Helvetica" w:eastAsia="Helvetica" w:hAnsi="Helvetica"/>
-                <w:b w:val="false"/>
-                <w:bCs w:val="false"/>
-                <w:color w:val="000000"/>
-                <w:sz w:val="16"/>
-                <w:szCs w:val="16"/>
-              </w:rPr>
-              <w:t xml:space="preserve">Mean spoke_to duration</w:t>
-            </w:r>
-          </w:p>
-        </w:tc>
-        <w:tc>
-          <w:tcPr>
-            <w:tcW w:type="dxa" w:w="2340"/>
-            <w:tcBorders>
-              <w:top w:val="single" w:color="CCCCCC" w:sz="1"/>
-              <w:left w:val="single" w:color="CCCCCC" w:sz="1"/>
-              <w:bottom w:val="single" w:color="CCCCCC" w:sz="1"/>
-              <w:right w:val="single" w:color="CCCCCC" w:sz="1"/>
-            </w:tcBorders>
-            <w:tcMar>
-              <w:top w:type="dxa" w:w="60"/>
-              <w:left w:type="dxa" w:w="100"/>
-              <w:bottom w:type="dxa" w:w="60"/>
-              <w:right w:type="dxa" w:w="100"/>
-            </w:tcMar>
-          </w:tcPr>
-          <w:p>
-            <w:pPr>
-              <w:jc w:val="center"/>
-            </w:pPr>
-            <w:r>
-              <w:rPr>
-                <w:rFonts w:ascii="Helvetica" w:cs="Helvetica" w:eastAsia="Helvetica" w:hAnsi="Helvetica"/>
-                <w:b w:val="false"/>
-                <w:bCs w:val="false"/>
-                <w:color w:val="000000"/>
-                <w:sz w:val="16"/>
-                <w:szCs w:val="16"/>
-              </w:rPr>
-              <w:t xml:space="preserve">47.2s</w:t>
-            </w:r>
-          </w:p>
-        </w:tc>
-        <w:tc>
-          <w:tcPr>
-            <w:tcW w:type="dxa" w:w="2340"/>
-            <w:tcBorders>
-              <w:top w:val="single" w:color="CCCCCC" w:sz="1"/>
-              <w:left w:val="single" w:color="CCCCCC" w:sz="1"/>
-              <w:bottom w:val="single" w:color="CCCCCC" w:sz="1"/>
-              <w:right w:val="single" w:color="CCCCCC" w:sz="1"/>
-            </w:tcBorders>
-            <w:tcMar>
-              <w:top w:type="dxa" w:w="60"/>
-              <w:left w:type="dxa" w:w="100"/>
-              <w:bottom w:type="dxa" w:w="60"/>
-              <w:right w:type="dxa" w:w="100"/>
-            </w:tcMar>
-          </w:tcPr>
-          <w:p>
-            <w:pPr>
-              <w:jc w:val="left"/>
-            </w:pPr>
-            <w:r>
-              <w:rPr>
-                <w:rFonts w:ascii="Helvetica" w:cs="Helvetica" w:eastAsia="Helvetica" w:hAnsi="Helvetica"/>
-                <w:b w:val="false"/>
-                <w:bCs w:val="false"/>
-                <w:color w:val="666666"/>
-                <w:sz w:val="16"/>
-                <w:szCs w:val="16"/>
-              </w:rPr>
-              <w:t xml:space="preserve">Skewed by 4 calls &gt;300s</w:t>
+              <w:t xml:space="preserve">11,331 seconds</w:t>
             </w:r>
           </w:p>
         </w:tc>
@@ -1293,7 +1167,23 @@
           <w:bCs/>
           <w:color w:val="1A1A2E"/>
         </w:rPr>
-        <w:t xml:space="preserve">Week-over-Week Trend</w:t>
+        <w:t xml:space="preserve">Trend</w:t>
+      </w:r>
+    </w:p>
+    <w:p>
+      <w:pPr>
+        <w:spacing w:after="100"/>
+      </w:pPr>
+      <w:r>
+        <w:rPr>
+          <w:rFonts w:ascii="Helvetica" w:cs="Helvetica" w:eastAsia="Helvetica" w:hAnsi="Helvetica"/>
+          <w:b w:val="false"/>
+          <w:bCs w:val="false"/>
+          <w:color w:val="666666"/>
+          <w:sz w:val="18"/>
+          <w:szCs w:val="18"/>
+        </w:rPr>
+        <w:t xml:space="preserve">W1/W2 are week totals from 2 locations. Apr 13 is a single day from 10 locations.</w:t>
       </w:r>
     </w:p>
     <w:tbl>
@@ -1347,7 +1237,7 @@
                 <w:sz w:val="16"/>
                 <w:szCs w:val="16"/>
               </w:rPr>
-              <w:t xml:space="preserve">Metric</w:t>
+              <w:t xml:space="preserve"/>
             </w:r>
           </w:p>
         </w:tc>
@@ -1516,8 +1406,8 @@
             <w:r>
               <w:rPr>
                 <w:rFonts w:ascii="Helvetica" w:cs="Helvetica" w:eastAsia="Helvetica" w:hAnsi="Helvetica"/>
-                <w:b w:val="false"/>
-                <w:bCs w:val="false"/>
+                <w:b/>
+                <w:bCs/>
                 <w:color w:val="000000"/>
                 <w:sz w:val="16"/>
                 <w:szCs w:val="16"/>
@@ -1683,13 +1573,13 @@
             <w:r>
               <w:rPr>
                 <w:rFonts w:ascii="Helvetica" w:cs="Helvetica" w:eastAsia="Helvetica" w:hAnsi="Helvetica"/>
-                <w:b w:val="false"/>
-                <w:bCs w:val="false"/>
-                <w:color w:val="000000"/>
-                <w:sz w:val="16"/>
-                <w:szCs w:val="16"/>
-              </w:rPr>
-              <w:t xml:space="preserve">Total calls</w:t>
+                <w:b/>
+                <w:bCs/>
+                <w:color w:val="000000"/>
+                <w:sz w:val="16"/>
+                <w:szCs w:val="16"/>
+              </w:rPr>
+              <w:t xml:space="preserve">Pickup rate</w:t>
             </w:r>
           </w:p>
         </w:tc>
@@ -1722,7 +1612,7 @@
                 <w:sz w:val="16"/>
                 <w:szCs w:val="16"/>
               </w:rPr>
-              <w:t xml:space="preserve">48</w:t>
+              <w:t xml:space="preserve">15.0%</w:t>
             </w:r>
           </w:p>
         </w:tc>
@@ -1755,7 +1645,7 @@
                 <w:sz w:val="16"/>
                 <w:szCs w:val="16"/>
               </w:rPr>
-              <w:t xml:space="preserve">82</w:t>
+              <w:t xml:space="preserve">19.5%</w:t>
             </w:r>
           </w:p>
         </w:tc>
@@ -1788,7 +1678,7 @@
                 <w:sz w:val="16"/>
                 <w:szCs w:val="16"/>
               </w:rPr>
-              <w:t xml:space="preserve">613</w:t>
+              <w:t xml:space="preserve">39.2%</w:t>
             </w:r>
           </w:p>
         </w:tc>
@@ -1821,7 +1711,7 @@
                 <w:sz w:val="16"/>
                 <w:szCs w:val="16"/>
               </w:rPr>
-              <w:t xml:space="preserve">~12x/day</w:t>
+              <w:t xml:space="preserve">2.6x</w:t>
             </w:r>
           </w:p>
         </w:tc>
@@ -1850,13 +1740,13 @@
             <w:r>
               <w:rPr>
                 <w:rFonts w:ascii="Helvetica" w:cs="Helvetica" w:eastAsia="Helvetica" w:hAnsi="Helvetica"/>
-                <w:b w:val="false"/>
-                <w:bCs w:val="false"/>
-                <w:color w:val="000000"/>
-                <w:sz w:val="16"/>
-                <w:szCs w:val="16"/>
-              </w:rPr>
-              <w:t xml:space="preserve">Pickup rate</w:t>
+                <w:b/>
+                <w:bCs/>
+                <w:color w:val="000000"/>
+                <w:sz w:val="16"/>
+                <w:szCs w:val="16"/>
+              </w:rPr>
+              <w:t xml:space="preserve">Calls/location/day</w:t>
             </w:r>
           </w:p>
         </w:tc>
@@ -1889,7 +1779,7 @@
                 <w:sz w:val="16"/>
                 <w:szCs w:val="16"/>
               </w:rPr>
-              <w:t xml:space="preserve">15.0%</w:t>
+              <w:t xml:space="preserve">~3</w:t>
             </w:r>
           </w:p>
         </w:tc>
@@ -1922,7 +1812,7 @@
                 <w:sz w:val="16"/>
                 <w:szCs w:val="16"/>
               </w:rPr>
-              <w:t xml:space="preserve">19.5%</w:t>
+              <w:t xml:space="preserve">~6</w:t>
             </w:r>
           </w:p>
         </w:tc>
@@ -1955,7 +1845,7 @@
                 <w:sz w:val="16"/>
                 <w:szCs w:val="16"/>
               </w:rPr>
-              <w:t xml:space="preserve">39.2%</w:t>
+              <w:t xml:space="preserve">~61</w:t>
             </w:r>
           </w:p>
         </w:tc>
@@ -1988,7 +1878,7 @@
                 <w:sz w:val="16"/>
                 <w:szCs w:val="16"/>
               </w:rPr>
-              <w:t xml:space="preserve">2.6x</w:t>
+              <w:t xml:space="preserve">Batch ↑</w:t>
             </w:r>
           </w:p>
         </w:tc>
@@ -2017,8 +1907,8 @@
             <w:r>
               <w:rPr>
                 <w:rFonts w:ascii="Helvetica" w:cs="Helvetica" w:eastAsia="Helvetica" w:hAnsi="Helvetica"/>
-                <w:b w:val="false"/>
-                <w:bCs w:val="false"/>
+                <w:b/>
+                <w:bCs/>
                 <w:color w:val="000000"/>
                 <w:sz w:val="16"/>
                 <w:szCs w:val="16"/>
@@ -2177,7 +2067,7 @@
           <w:bCs/>
           <w:color w:val="1A1A2E"/>
         </w:rPr>
-        <w:t xml:space="preserve">2. Per-Location Performance</w:t>
+        <w:t xml:space="preserve">2. Per-Location Breakdown</w:t>
       </w:r>
     </w:p>
     <w:p>
@@ -2193,7 +2083,7 @@
           <w:sz w:val="18"/>
           <w:szCs w:val="18"/>
         </w:rPr>
-        <w:t xml:space="preserve">Ranked by pickup rate. New locations (39.7%) outperform original pilot locations (37.2%).</w:t>
+        <w:t xml:space="preserve">Ranked by pickup rate. New locations match or beat the original pilots — the platform generalizes. Note: with only 54–67 calls per location, these numbers are directional, not definitive.</w:t>
       </w:r>
     </w:p>
     <w:p>
@@ -4256,7 +4146,7 @@
           <w:bCs/>
           <w:color w:val="1A1A2E"/>
         </w:rPr>
-        <w:t xml:space="preserve">3. Conversation Quality</w:t>
+        <w:t xml:space="preserve">3. The Problem: Reach Is Good, Conversations Aren’t</w:t>
       </w:r>
     </w:p>
     <w:p>
@@ -4272,27 +4162,13 @@
           <w:sz w:val="18"/>
           <w:szCs w:val="18"/>
         </w:rPr>
-        <w:t xml:space="preserve">73% of connected calls do not produce real dialog. The median call is 18 seconds. 97.9% end with the member hanging up.</w:t>
+        <w:t xml:space="preserve">We’re reaching members at scale. But most calls don’t turn into real conversations, and almost none produce a booking or next step.</w:t>
       </w:r>
     </w:p>
     <w:p>
       <w:pPr>
         <w:spacing w:after="80" w:before="80"/>
       </w:pPr>
-    </w:p>
-    <w:p>
-      <w:pPr>
-        <w:pStyle w:val="Heading3"/>
-      </w:pPr>
-      <w:r>
-        <w:rPr>
-          <w:rFonts w:ascii="Helvetica" w:cs="Helvetica" w:eastAsia="Helvetica" w:hAnsi="Helvetica"/>
-          <w:b/>
-          <w:bCs/>
-          <w:color w:val="1A1A2E"/>
-        </w:rPr>
-        <w:t xml:space="preserve">Engagement Depth</w:t>
-      </w:r>
     </w:p>
     <w:tbl>
       <w:tblPr>
@@ -4449,7 +4325,7 @@
                 <w:sz w:val="16"/>
                 <w:szCs w:val="16"/>
               </w:rPr>
-              <w:t xml:space="preserve">Assessment</w:t>
+              <w:t xml:space="preserve">What It Means</w:t>
             </w:r>
           </w:p>
         </w:tc>
@@ -4484,7 +4360,7 @@
                 <w:sz w:val="16"/>
                 <w:szCs w:val="16"/>
               </w:rPr>
-              <w:t xml:space="preserve">Real dialog (2+ member turns)</w:t>
+              <w:t xml:space="preserve">Real dialog (member spoke 2+ times)</w:t>
             </w:r>
           </w:p>
         </w:tc>
@@ -4579,11 +4455,11 @@
                 <w:rFonts w:ascii="Helvetica" w:cs="Helvetica" w:eastAsia="Helvetica" w:hAnsi="Helvetica"/>
                 <w:b w:val="false"/>
                 <w:bCs w:val="false"/>
-                <w:color w:val="CC0000"/>
-                <w:sz w:val="16"/>
-                <w:szCs w:val="16"/>
-              </w:rPr>
-              <w:t xml:space="preserve">Low</w:t>
+                <w:color w:val="666666"/>
+                <w:sz w:val="16"/>
+                <w:szCs w:val="16"/>
+              </w:rPr>
+              <w:t xml:space="preserve">73% of pickups go nowhere</w:t>
             </w:r>
           </w:p>
         </w:tc>
@@ -4713,11 +4589,11 @@
                 <w:rFonts w:ascii="Helvetica" w:cs="Helvetica" w:eastAsia="Helvetica" w:hAnsi="Helvetica"/>
                 <w:b w:val="false"/>
                 <w:bCs w:val="false"/>
-                <w:color w:val="CC0000"/>
-                <w:sz w:val="16"/>
-                <w:szCs w:val="16"/>
-              </w:rPr>
-              <w:t xml:space="preserve">Low</w:t>
+                <w:color w:val="666666"/>
+                <w:sz w:val="16"/>
+                <w:szCs w:val="16"/>
+              </w:rPr>
+              <w:t xml:space="preserve">Most calls under 20 seconds</w:t>
             </w:r>
           </w:p>
         </w:tc>
@@ -4851,7 +4727,7 @@
                 <w:sz w:val="16"/>
                 <w:szCs w:val="16"/>
               </w:rPr>
-              <w:t xml:space="preserve">Structural but high</w:t>
+              <w:t xml:space="preserve">Agent almost never closes naturally</w:t>
             </w:r>
           </w:p>
         </w:tc>
@@ -4886,7 +4762,7 @@
                 <w:sz w:val="16"/>
                 <w:szCs w:val="16"/>
               </w:rPr>
-              <w:t xml:space="preserve">Clean close (agent-initiated)</w:t>
+              <w:t xml:space="preserve">Agent-initiated close</w:t>
             </w:r>
           </w:p>
         </w:tc>
@@ -4981,16 +4857,37 @@
                 <w:rFonts w:ascii="Helvetica" w:cs="Helvetica" w:eastAsia="Helvetica" w:hAnsi="Helvetica"/>
                 <w:b w:val="false"/>
                 <w:bCs w:val="false"/>
-                <w:color w:val="CC0000"/>
-                <w:sz w:val="16"/>
-                <w:szCs w:val="16"/>
-              </w:rPr>
-              <w:t xml:space="preserve">Very low</w:t>
+                <w:color w:val="666666"/>
+                <w:sz w:val="16"/>
+                <w:szCs w:val="16"/>
+              </w:rPr>
+              <w:t xml:space="preserve">Only 5 calls ended on our terms</w:t>
             </w:r>
           </w:p>
         </w:tc>
       </w:tr>
     </w:tbl>
+    <w:p>
+      <w:pPr>
+        <w:spacing w:after="80" w:before="80"/>
+      </w:pPr>
+    </w:p>
+    <w:p>
+      <w:pPr>
+        <w:spacing w:after="100"/>
+      </w:pPr>
+      <w:r>
+        <w:rPr>
+          <w:rFonts w:ascii="Helvetica" w:cs="Helvetica" w:eastAsia="Helvetica" w:hAnsi="Helvetica"/>
+          <w:b w:val="false"/>
+          <w:bCs w:val="false"/>
+          <w:color w:val="666666"/>
+          <w:sz w:val="18"/>
+          <w:szCs w:val="18"/>
+        </w:rPr>
+        <w:t xml:space="preserve">For context: industry benchmarks for outbound calling show 60–75% of connected calls should produce a real conversation. We’re at 27%. Even cold callers calling strangers do better than this.</w:t>
+      </w:r>
+    </w:p>
     <w:p>
       <w:pPr>
         <w:spacing w:after="80" w:before="80"/>
@@ -5165,7 +5062,7 @@
                 <w:sz w:val="16"/>
                 <w:szCs w:val="16"/>
               </w:rPr>
-              <w:t xml:space="preserve">Note</w:t>
+              <w:t xml:space="preserve"/>
             </w:r>
           </w:p>
         </w:tc>
@@ -5299,7 +5196,7 @@
                 <w:sz w:val="16"/>
                 <w:szCs w:val="16"/>
               </w:rPr>
-              <w:t xml:space="preserve">Campaign topic</w:t>
+              <w:t xml:space="preserve">On-message</w:t>
             </w:r>
           </w:p>
         </w:tc>
@@ -5433,7 +5330,7 @@
                 <w:sz w:val="16"/>
                 <w:szCs w:val="16"/>
               </w:rPr>
-              <w:t xml:space="preserve">Very low conversion</w:t>
+              <w:t xml:space="preserve">Near zero</w:t>
             </w:r>
           </w:p>
         </w:tc>
@@ -5468,7 +5365,7 @@
                 <w:sz w:val="16"/>
                 <w:szCs w:val="16"/>
               </w:rPr>
-              <w:t xml:space="preserve">Member info requests (pricing, hours)</w:t>
+              <w:t xml:space="preserve">Member asked about pricing or hours</w:t>
             </w:r>
           </w:p>
         </w:tc>
@@ -5567,7 +5464,7 @@
                 <w:sz w:val="16"/>
                 <w:szCs w:val="16"/>
               </w:rPr>
-              <w:t xml:space="preserve">Zero members asked</w:t>
+              <w:t xml:space="preserve">Nobody was curious enough to ask</w:t>
             </w:r>
           </w:p>
         </w:tc>
@@ -5701,7 +5598,7 @@
                 <w:sz w:val="16"/>
                 <w:szCs w:val="16"/>
               </w:rPr>
-              <w:t xml:space="preserve">Massively underused</w:t>
+              <w:t xml:space="preserve">We’re barely using this channel</w:t>
             </w:r>
           </w:p>
         </w:tc>
@@ -5835,7 +5732,193 @@
                 <w:sz w:val="16"/>
                 <w:szCs w:val="16"/>
               </w:rPr>
-              <w:t xml:space="preserve">Very low — good</w:t>
+              <w:t xml:space="preserve">Members aren’t hostile</w:t>
+            </w:r>
+          </w:p>
+        </w:tc>
+      </w:tr>
+    </w:tbl>
+    <w:p>
+      <w:pPr>
+        <w:spacing w:after="80" w:before="80"/>
+      </w:pPr>
+    </w:p>
+    <w:p>
+      <w:pPr>
+        <w:spacing w:after="100"/>
+      </w:pPr>
+      <w:r>
+        <w:rPr>
+          <w:rFonts w:ascii="Helvetica" w:cs="Helvetica" w:eastAsia="Helvetica" w:hAnsi="Helvetica"/>
+          <w:b w:val="false"/>
+          <w:bCs w:val="false"/>
+          <w:color w:val="000000"/>
+          <w:sz w:val="18"/>
+          <w:szCs w:val="18"/>
+        </w:rPr>
+        <w:t xml:space="preserve">The zero on member info requests is the most telling number. Members aren’t engaged enough to even be curious. The agent talks about recovery services; members either briefly acknowledge or hang up.</w:t>
+      </w:r>
+    </w:p>
+    <w:p>
+      <w:r>
+        <w:br w:type="page"/>
+      </w:r>
+    </w:p>
+    <w:p>
+      <w:pPr>
+        <w:pStyle w:val="Heading1"/>
+      </w:pPr>
+      <w:r>
+        <w:rPr>
+          <w:rFonts w:ascii="Helvetica" w:cs="Helvetica" w:eastAsia="Helvetica" w:hAnsi="Helvetica"/>
+          <w:b/>
+          <w:bCs/>
+          <w:color w:val="1A1A2E"/>
+        </w:rPr>
+        <w:t xml:space="preserve">4. The Fix: We Already Have Proof It Works</w:t>
+      </w:r>
+    </w:p>
+    <w:p>
+      <w:pPr>
+        <w:spacing w:after="100"/>
+      </w:pPr>
+      <w:r>
+        <w:rPr>
+          <w:rFonts w:ascii="Helvetica" w:cs="Helvetica" w:eastAsia="Helvetica" w:hAnsi="Helvetica"/>
+          <w:b w:val="false"/>
+          <w:bCs w:val="false"/>
+          <w:color w:val="000000"/>
+          <w:sz w:val="18"/>
+          <w:szCs w:val="18"/>
+        </w:rPr>
+        <w:t xml:space="preserve">We found a natural experiment buried in the data. Some calls pass through carrier call screening (“If you record your name, I’ll see if this person is available”). Those calls go dramatically better:</w:t>
+      </w:r>
+    </w:p>
+    <w:p>
+      <w:pPr>
+        <w:spacing w:after="80" w:before="80"/>
+      </w:pPr>
+    </w:p>
+    <w:tbl>
+      <w:tblPr>
+        <w:tblW w:type="dxa" w:w="9360"/>
+        <w:tblBorders>
+          <w:top w:val="single" w:color="auto" w:sz="4"/>
+          <w:left w:val="single" w:color="auto" w:sz="4"/>
+          <w:bottom w:val="single" w:color="auto" w:sz="4"/>
+          <w:right w:val="single" w:color="auto" w:sz="4"/>
+          <w:insideH w:val="single" w:color="auto" w:sz="4"/>
+          <w:insideV w:val="single" w:color="auto" w:sz="4"/>
+        </w:tblBorders>
+      </w:tblPr>
+      <w:tblGrid>
+        <w:gridCol w:w="4680"/>
+        <w:gridCol w:w="2340"/>
+        <w:gridCol w:w="2340"/>
+      </w:tblGrid>
+      <w:tr>
+        <w:tc>
+          <w:tcPr>
+            <w:tcW w:type="dxa" w:w="4680"/>
+            <w:tcBorders>
+              <w:top w:val="single" w:color="CCCCCC" w:sz="1"/>
+              <w:left w:val="single" w:color="CCCCCC" w:sz="1"/>
+              <w:bottom w:val="single" w:color="CCCCCC" w:sz="1"/>
+              <w:right w:val="single" w:color="CCCCCC" w:sz="1"/>
+            </w:tcBorders>
+            <w:shd w:fill="1A1A2E" w:val="clear"/>
+            <w:tcMar>
+              <w:top w:type="dxa" w:w="60"/>
+              <w:left w:type="dxa" w:w="100"/>
+              <w:bottom w:type="dxa" w:w="60"/>
+              <w:right w:type="dxa" w:w="100"/>
+            </w:tcMar>
+            <w:vAlign w:val="center"/>
+          </w:tcPr>
+          <w:p>
+            <w:pPr>
+              <w:jc w:val="center"/>
+            </w:pPr>
+            <w:r>
+              <w:rPr>
+                <w:rFonts w:ascii="Helvetica" w:cs="Helvetica" w:eastAsia="Helvetica" w:hAnsi="Helvetica"/>
+                <w:b/>
+                <w:bCs/>
+                <w:color w:val="FFFFFF"/>
+                <w:sz w:val="16"/>
+                <w:szCs w:val="16"/>
+              </w:rPr>
+              <w:t xml:space="preserve"/>
+            </w:r>
+          </w:p>
+        </w:tc>
+        <w:tc>
+          <w:tcPr>
+            <w:tcW w:type="dxa" w:w="2340"/>
+            <w:tcBorders>
+              <w:top w:val="single" w:color="CCCCCC" w:sz="1"/>
+              <w:left w:val="single" w:color="CCCCCC" w:sz="1"/>
+              <w:bottom w:val="single" w:color="CCCCCC" w:sz="1"/>
+              <w:right w:val="single" w:color="CCCCCC" w:sz="1"/>
+            </w:tcBorders>
+            <w:shd w:fill="1A1A2E" w:val="clear"/>
+            <w:tcMar>
+              <w:top w:type="dxa" w:w="60"/>
+              <w:left w:type="dxa" w:w="100"/>
+              <w:bottom w:type="dxa" w:w="60"/>
+              <w:right w:type="dxa" w:w="100"/>
+            </w:tcMar>
+            <w:vAlign w:val="center"/>
+          </w:tcPr>
+          <w:p>
+            <w:pPr>
+              <w:jc w:val="center"/>
+            </w:pPr>
+            <w:r>
+              <w:rPr>
+                <w:rFonts w:ascii="Helvetica" w:cs="Helvetica" w:eastAsia="Helvetica" w:hAnsi="Helvetica"/>
+                <w:b/>
+                <w:bCs/>
+                <w:color w:val="FFFFFF"/>
+                <w:sz w:val="16"/>
+                <w:szCs w:val="16"/>
+              </w:rPr>
+              <w:t xml:space="preserve">Screened Calls</w:t>
+            </w:r>
+          </w:p>
+        </w:tc>
+        <w:tc>
+          <w:tcPr>
+            <w:tcW w:type="dxa" w:w="2340"/>
+            <w:tcBorders>
+              <w:top w:val="single" w:color="CCCCCC" w:sz="1"/>
+              <w:left w:val="single" w:color="CCCCCC" w:sz="1"/>
+              <w:bottom w:val="single" w:color="CCCCCC" w:sz="1"/>
+              <w:right w:val="single" w:color="CCCCCC" w:sz="1"/>
+            </w:tcBorders>
+            <w:shd w:fill="1A1A2E" w:val="clear"/>
+            <w:tcMar>
+              <w:top w:type="dxa" w:w="60"/>
+              <w:left w:type="dxa" w:w="100"/>
+              <w:bottom w:type="dxa" w:w="60"/>
+              <w:right w:type="dxa" w:w="100"/>
+            </w:tcMar>
+            <w:vAlign w:val="center"/>
+          </w:tcPr>
+          <w:p>
+            <w:pPr>
+              <w:jc w:val="center"/>
+            </w:pPr>
+            <w:r>
+              <w:rPr>
+                <w:rFonts w:ascii="Helvetica" w:cs="Helvetica" w:eastAsia="Helvetica" w:hAnsi="Helvetica"/>
+                <w:b/>
+                <w:bCs/>
+                <w:color w:val="FFFFFF"/>
+                <w:sz w:val="16"/>
+                <w:szCs w:val="16"/>
+              </w:rPr>
+              <w:t xml:space="preserve">Unscreened Calls</w:t>
             </w:r>
           </w:p>
         </w:tc>
@@ -5843,7 +5926,7 @@
       <w:tr>
         <w:tc>
           <w:tcPr>
-            <w:tcW w:type="dxa" w:w="4200"/>
+            <w:tcW w:type="dxa" w:w="4680"/>
             <w:tcBorders>
               <w:top w:val="single" w:color="CCCCCC" w:sz="1"/>
               <w:left w:val="single" w:color="CCCCCC" w:sz="1"/>
@@ -5864,41 +5947,600 @@
             <w:r>
               <w:rPr>
                 <w:rFonts w:ascii="Helvetica" w:cs="Helvetica" w:eastAsia="Helvetica" w:hAnsi="Helvetica"/>
-                <w:b w:val="false"/>
-                <w:bCs w:val="false"/>
-                <w:color w:val="000000"/>
-                <w:sz w:val="16"/>
-                <w:szCs w:val="16"/>
-              </w:rPr>
-              <w:t xml:space="preserve">Agent offered transfer</w:t>
-            </w:r>
-          </w:p>
-        </w:tc>
-        <w:tc>
-          <w:tcPr>
-            <w:tcW w:type="dxa" w:w="1200"/>
-            <w:tcBorders>
-              <w:top w:val="single" w:color="CCCCCC" w:sz="1"/>
-              <w:left w:val="single" w:color="CCCCCC" w:sz="1"/>
-              <w:bottom w:val="single" w:color="CCCCCC" w:sz="1"/>
-              <w:right w:val="single" w:color="CCCCCC" w:sz="1"/>
-            </w:tcBorders>
-            <w:tcMar>
-              <w:top w:type="dxa" w:w="60"/>
-              <w:left w:type="dxa" w:w="100"/>
-              <w:bottom w:type="dxa" w:w="60"/>
-              <w:right w:type="dxa" w:w="100"/>
-            </w:tcMar>
-          </w:tcPr>
-          <w:p>
-            <w:pPr>
-              <w:jc w:val="center"/>
-            </w:pPr>
-            <w:r>
-              <w:rPr>
-                <w:rFonts w:ascii="Helvetica" w:cs="Helvetica" w:eastAsia="Helvetica" w:hAnsi="Helvetica"/>
-                <w:b w:val="false"/>
-                <w:bCs w:val="false"/>
+                <w:b/>
+                <w:bCs/>
+                <w:color w:val="000000"/>
+                <w:sz w:val="16"/>
+                <w:szCs w:val="16"/>
+              </w:rPr>
+              <w:t xml:space="preserve">Success rate (real conversation)</w:t>
+            </w:r>
+          </w:p>
+        </w:tc>
+        <w:tc>
+          <w:tcPr>
+            <w:tcW w:type="dxa" w:w="2340"/>
+            <w:tcBorders>
+              <w:top w:val="single" w:color="CCCCCC" w:sz="1"/>
+              <w:left w:val="single" w:color="CCCCCC" w:sz="1"/>
+              <w:bottom w:val="single" w:color="CCCCCC" w:sz="1"/>
+              <w:right w:val="single" w:color="CCCCCC" w:sz="1"/>
+            </w:tcBorders>
+            <w:tcMar>
+              <w:top w:type="dxa" w:w="60"/>
+              <w:left w:type="dxa" w:w="100"/>
+              <w:bottom w:type="dxa" w:w="60"/>
+              <w:right w:type="dxa" w:w="100"/>
+            </w:tcMar>
+          </w:tcPr>
+          <w:p>
+            <w:pPr>
+              <w:jc w:val="center"/>
+            </w:pPr>
+            <w:r>
+              <w:rPr>
+                <w:rFonts w:ascii="Helvetica" w:cs="Helvetica" w:eastAsia="Helvetica" w:hAnsi="Helvetica"/>
+                <w:b/>
+                <w:bCs/>
+                <w:color w:val="006600"/>
+                <w:sz w:val="16"/>
+                <w:szCs w:val="16"/>
+              </w:rPr>
+              <w:t xml:space="preserve">48.7%</w:t>
+            </w:r>
+          </w:p>
+        </w:tc>
+        <w:tc>
+          <w:tcPr>
+            <w:tcW w:type="dxa" w:w="2340"/>
+            <w:tcBorders>
+              <w:top w:val="single" w:color="CCCCCC" w:sz="1"/>
+              <w:left w:val="single" w:color="CCCCCC" w:sz="1"/>
+              <w:bottom w:val="single" w:color="CCCCCC" w:sz="1"/>
+              <w:right w:val="single" w:color="CCCCCC" w:sz="1"/>
+            </w:tcBorders>
+            <w:tcMar>
+              <w:top w:type="dxa" w:w="60"/>
+              <w:left w:type="dxa" w:w="100"/>
+              <w:bottom w:type="dxa" w:w="60"/>
+              <w:right w:type="dxa" w:w="100"/>
+            </w:tcMar>
+          </w:tcPr>
+          <w:p>
+            <w:pPr>
+              <w:jc w:val="center"/>
+            </w:pPr>
+            <w:r>
+              <w:rPr>
+                <w:rFonts w:ascii="Helvetica" w:cs="Helvetica" w:eastAsia="Helvetica" w:hAnsi="Helvetica"/>
+                <w:b/>
+                <w:bCs/>
+                <w:color w:val="CC0000"/>
+                <w:sz w:val="16"/>
+                <w:szCs w:val="16"/>
+              </w:rPr>
+              <w:t xml:space="preserve">7.0%</w:t>
+            </w:r>
+          </w:p>
+        </w:tc>
+      </w:tr>
+      <w:tr>
+        <w:tc>
+          <w:tcPr>
+            <w:tcW w:type="dxa" w:w="4680"/>
+            <w:tcBorders>
+              <w:top w:val="single" w:color="CCCCCC" w:sz="1"/>
+              <w:left w:val="single" w:color="CCCCCC" w:sz="1"/>
+              <w:bottom w:val="single" w:color="CCCCCC" w:sz="1"/>
+              <w:right w:val="single" w:color="CCCCCC" w:sz="1"/>
+            </w:tcBorders>
+            <w:tcMar>
+              <w:top w:type="dxa" w:w="60"/>
+              <w:left w:type="dxa" w:w="100"/>
+              <w:bottom w:type="dxa" w:w="60"/>
+              <w:right w:type="dxa" w:w="100"/>
+            </w:tcMar>
+          </w:tcPr>
+          <w:p>
+            <w:pPr>
+              <w:jc w:val="left"/>
+            </w:pPr>
+            <w:r>
+              <w:rPr>
+                <w:rFonts w:ascii="Helvetica" w:cs="Helvetica" w:eastAsia="Helvetica" w:hAnsi="Helvetica"/>
+                <w:b/>
+                <w:bCs/>
+                <w:color w:val="000000"/>
+                <w:sz w:val="16"/>
+                <w:szCs w:val="16"/>
+              </w:rPr>
+              <w:t xml:space="preserve">Difference</w:t>
+            </w:r>
+          </w:p>
+        </w:tc>
+        <w:tc>
+          <w:tcPr>
+            <w:tcW w:type="dxa" w:w="2340"/>
+            <w:tcBorders>
+              <w:top w:val="single" w:color="CCCCCC" w:sz="1"/>
+              <w:left w:val="single" w:color="CCCCCC" w:sz="1"/>
+              <w:bottom w:val="single" w:color="CCCCCC" w:sz="1"/>
+              <w:right w:val="single" w:color="CCCCCC" w:sz="1"/>
+            </w:tcBorders>
+            <w:tcMar>
+              <w:top w:type="dxa" w:w="60"/>
+              <w:left w:type="dxa" w:w="100"/>
+              <w:bottom w:type="dxa" w:w="60"/>
+              <w:right w:type="dxa" w:w="100"/>
+            </w:tcMar>
+          </w:tcPr>
+          <w:p>
+            <w:pPr>
+              <w:jc w:val="center"/>
+            </w:pPr>
+            <w:r>
+              <w:rPr>
+                <w:rFonts w:ascii="Helvetica" w:cs="Helvetica" w:eastAsia="Helvetica" w:hAnsi="Helvetica"/>
+                <w:b/>
+                <w:bCs/>
+                <w:color w:val="4A3F8F"/>
+                <w:sz w:val="16"/>
+                <w:szCs w:val="16"/>
+              </w:rPr>
+              <w:t xml:space="preserve">7x better</w:t>
+            </w:r>
+          </w:p>
+        </w:tc>
+        <w:tc>
+          <w:tcPr>
+            <w:tcW w:type="dxa" w:w="2340"/>
+            <w:tcBorders>
+              <w:top w:val="single" w:color="CCCCCC" w:sz="1"/>
+              <w:left w:val="single" w:color="CCCCCC" w:sz="1"/>
+              <w:bottom w:val="single" w:color="CCCCCC" w:sz="1"/>
+              <w:right w:val="single" w:color="CCCCCC" w:sz="1"/>
+            </w:tcBorders>
+            <w:tcMar>
+              <w:top w:type="dxa" w:w="60"/>
+              <w:left w:type="dxa" w:w="100"/>
+              <w:bottom w:type="dxa" w:w="60"/>
+              <w:right w:type="dxa" w:w="100"/>
+            </w:tcMar>
+          </w:tcPr>
+          <w:p>
+            <w:pPr>
+              <w:jc w:val="left"/>
+            </w:pPr>
+            <w:r>
+              <w:rPr>
+                <w:rFonts w:ascii="Helvetica" w:cs="Helvetica" w:eastAsia="Helvetica" w:hAnsi="Helvetica"/>
+                <w:b w:val="false"/>
+                <w:bCs w:val="false"/>
+                <w:color w:val="000000"/>
+                <w:sz w:val="16"/>
+                <w:szCs w:val="16"/>
+              </w:rPr>
+              <w:t xml:space="preserve"/>
+            </w:r>
+          </w:p>
+        </w:tc>
+      </w:tr>
+      <w:tr>
+        <w:tc>
+          <w:tcPr>
+            <w:tcW w:type="dxa" w:w="4680"/>
+            <w:tcBorders>
+              <w:top w:val="single" w:color="CCCCCC" w:sz="1"/>
+              <w:left w:val="single" w:color="CCCCCC" w:sz="1"/>
+              <w:bottom w:val="single" w:color="CCCCCC" w:sz="1"/>
+              <w:right w:val="single" w:color="CCCCCC" w:sz="1"/>
+            </w:tcBorders>
+            <w:tcMar>
+              <w:top w:type="dxa" w:w="60"/>
+              <w:left w:type="dxa" w:w="100"/>
+              <w:bottom w:type="dxa" w:w="60"/>
+              <w:right w:type="dxa" w:w="100"/>
+            </w:tcMar>
+          </w:tcPr>
+          <w:p>
+            <w:pPr>
+              <w:jc w:val="left"/>
+            </w:pPr>
+            <w:r>
+              <w:rPr>
+                <w:rFonts w:ascii="Helvetica" w:cs="Helvetica" w:eastAsia="Helvetica" w:hAnsi="Helvetica"/>
+                <w:b w:val="false"/>
+                <w:bCs w:val="false"/>
+                <w:color w:val="000000"/>
+                <w:sz w:val="16"/>
+                <w:szCs w:val="16"/>
+              </w:rPr>
+              <w:t xml:space="preserve">Statistical confidence</w:t>
+            </w:r>
+          </w:p>
+        </w:tc>
+        <w:tc>
+          <w:tcPr>
+            <w:tcW w:type="dxa" w:w="2340"/>
+            <w:tcBorders>
+              <w:top w:val="single" w:color="CCCCCC" w:sz="1"/>
+              <w:left w:val="single" w:color="CCCCCC" w:sz="1"/>
+              <w:bottom w:val="single" w:color="CCCCCC" w:sz="1"/>
+              <w:right w:val="single" w:color="CCCCCC" w:sz="1"/>
+            </w:tcBorders>
+            <w:tcMar>
+              <w:top w:type="dxa" w:w="60"/>
+              <w:left w:type="dxa" w:w="100"/>
+              <w:bottom w:type="dxa" w:w="60"/>
+              <w:right w:type="dxa" w:w="100"/>
+            </w:tcMar>
+          </w:tcPr>
+          <w:p>
+            <w:pPr>
+              <w:jc w:val="center"/>
+            </w:pPr>
+            <w:r>
+              <w:rPr>
+                <w:rFonts w:ascii="Helvetica" w:cs="Helvetica" w:eastAsia="Helvetica" w:hAnsi="Helvetica"/>
+                <w:b w:val="false"/>
+                <w:bCs w:val="false"/>
+                <w:color w:val="666666"/>
+                <w:sz w:val="16"/>
+                <w:szCs w:val="16"/>
+              </w:rPr>
+              <w:t xml:space="preserve">Not a fluke (p &lt; 0.000000001)</w:t>
+            </w:r>
+          </w:p>
+        </w:tc>
+        <w:tc>
+          <w:tcPr>
+            <w:tcW w:type="dxa" w:w="2340"/>
+            <w:tcBorders>
+              <w:top w:val="single" w:color="CCCCCC" w:sz="1"/>
+              <w:left w:val="single" w:color="CCCCCC" w:sz="1"/>
+              <w:bottom w:val="single" w:color="CCCCCC" w:sz="1"/>
+              <w:right w:val="single" w:color="CCCCCC" w:sz="1"/>
+            </w:tcBorders>
+            <w:tcMar>
+              <w:top w:type="dxa" w:w="60"/>
+              <w:left w:type="dxa" w:w="100"/>
+              <w:bottom w:type="dxa" w:w="60"/>
+              <w:right w:type="dxa" w:w="100"/>
+            </w:tcMar>
+          </w:tcPr>
+          <w:p>
+            <w:pPr>
+              <w:jc w:val="left"/>
+            </w:pPr>
+            <w:r>
+              <w:rPr>
+                <w:rFonts w:ascii="Helvetica" w:cs="Helvetica" w:eastAsia="Helvetica" w:hAnsi="Helvetica"/>
+                <w:b w:val="false"/>
+                <w:bCs w:val="false"/>
+                <w:color w:val="000000"/>
+                <w:sz w:val="16"/>
+                <w:szCs w:val="16"/>
+              </w:rPr>
+              <w:t xml:space="preserve"/>
+            </w:r>
+          </w:p>
+        </w:tc>
+      </w:tr>
+    </w:tbl>
+    <w:p>
+      <w:pPr>
+        <w:spacing w:after="80" w:before="80"/>
+      </w:pPr>
+    </w:p>
+    <w:p>
+      <w:pPr>
+        <w:pStyle w:val="Heading3"/>
+      </w:pPr>
+      <w:r>
+        <w:rPr>
+          <w:rFonts w:ascii="Helvetica" w:cs="Helvetica" w:eastAsia="Helvetica" w:hAnsi="Helvetica"/>
+          <w:b/>
+          <w:bCs/>
+          <w:color w:val="1A1A2E"/>
+        </w:rPr>
+        <w:t xml:space="preserve">Why Does Screening Help?</w:t>
+      </w:r>
+    </w:p>
+    <w:p>
+      <w:pPr>
+        <w:spacing w:after="100"/>
+      </w:pPr>
+      <w:r>
+        <w:rPr>
+          <w:rFonts w:ascii="Helvetica" w:cs="Helvetica" w:eastAsia="Helvetica" w:hAnsi="Helvetica"/>
+          <w:b w:val="false"/>
+          <w:bCs w:val="false"/>
+          <w:color w:val="000000"/>
+          <w:sz w:val="18"/>
+          <w:szCs w:val="18"/>
+        </w:rPr>
+        <w:t xml:space="preserve">Call screening forces the agent through a different opening. Instead of jumping straight into the pitch, the agent has to re-introduce itself after the screening prompt. This produces a more natural sequence:</w:t>
+      </w:r>
+    </w:p>
+    <w:p>
+      <w:pPr>
+        <w:spacing w:after="80" w:before="80"/>
+      </w:pPr>
+    </w:p>
+    <w:p>
+      <w:pPr>
+        <w:spacing w:after="60"/>
+      </w:pPr>
+      <w:r>
+        <w:rPr>
+          <w:rFonts w:ascii="Helvetica" w:cs="Helvetica" w:eastAsia="Helvetica" w:hAnsi="Helvetica"/>
+          <w:b/>
+          <w:bCs/>
+          <w:color w:val="CC0000"/>
+          <w:sz w:val="18"/>
+          <w:szCs w:val="18"/>
+        </w:rPr>
+        <w:t xml:space="preserve">Default (broken): </w:t>
+      </w:r>
+      <w:r>
+        <w:rPr>
+          <w:rFonts w:ascii="Helvetica" w:cs="Helvetica" w:eastAsia="Helvetica" w:hAnsi="Helvetica"/>
+          <w:sz w:val="18"/>
+          <w:szCs w:val="18"/>
+        </w:rPr>
+        <w:t xml:space="preserve">Pitch → Disclaimer → Member hangs up</w:t>
+      </w:r>
+    </w:p>
+    <w:p>
+      <w:pPr>
+        <w:spacing w:after="60"/>
+      </w:pPr>
+      <w:r>
+        <w:rPr>
+          <w:rFonts w:ascii="Helvetica" w:cs="Helvetica" w:eastAsia="Helvetica" w:hAnsi="Helvetica"/>
+          <w:b/>
+          <w:bCs/>
+          <w:color w:val="006600"/>
+          <w:sz w:val="18"/>
+          <w:szCs w:val="18"/>
+        </w:rPr>
+        <w:t xml:space="preserve">Screened (works): </w:t>
+      </w:r>
+      <w:r>
+        <w:rPr>
+          <w:rFonts w:ascii="Helvetica" w:cs="Helvetica" w:eastAsia="Helvetica" w:hAnsi="Helvetica"/>
+          <w:sz w:val="18"/>
+          <w:szCs w:val="18"/>
+        </w:rPr>
+        <w:t xml:space="preserve">Greeting → Disclaimer → Pitch → Member engages</w:t>
+      </w:r>
+    </w:p>
+    <w:p>
+      <w:pPr>
+        <w:spacing w:after="80" w:before="80"/>
+      </w:pPr>
+    </w:p>
+    <w:p>
+      <w:pPr>
+        <w:spacing w:after="100"/>
+      </w:pPr>
+      <w:r>
+        <w:rPr>
+          <w:rFonts w:ascii="Helvetica" w:cs="Helvetica" w:eastAsia="Helvetica" w:hAnsi="Helvetica"/>
+          <w:b/>
+          <w:bCs/>
+          <w:color w:val="000000"/>
+          <w:sz w:val="18"/>
+          <w:szCs w:val="18"/>
+        </w:rPr>
+        <w:t xml:space="preserve">The fix is straightforward: restructure the default opening to mimic the screened path. Greeting first, then disclaimer, then pitch. No new technology needed — just reorder what’s already there.</w:t>
+      </w:r>
+    </w:p>
+    <w:p>
+      <w:pPr>
+        <w:spacing w:after="80" w:before="80"/>
+      </w:pPr>
+    </w:p>
+    <w:p>
+      <w:pPr>
+        <w:pStyle w:val="Heading3"/>
+      </w:pPr>
+      <w:r>
+        <w:rPr>
+          <w:rFonts w:ascii="Helvetica" w:cs="Helvetica" w:eastAsia="Helvetica" w:hAnsi="Helvetica"/>
+          <w:b/>
+          <w:bCs/>
+          <w:color w:val="1A1A2E"/>
+        </w:rPr>
+        <w:t xml:space="preserve">Other Root Cause Findings</w:t>
+      </w:r>
+    </w:p>
+    <w:tbl>
+      <w:tblPr>
+        <w:tblW w:type="dxa" w:w="9360"/>
+        <w:tblBorders>
+          <w:top w:val="single" w:color="auto" w:sz="4"/>
+          <w:left w:val="single" w:color="auto" w:sz="4"/>
+          <w:bottom w:val="single" w:color="auto" w:sz="4"/>
+          <w:right w:val="single" w:color="auto" w:sz="4"/>
+          <w:insideH w:val="single" w:color="auto" w:sz="4"/>
+          <w:insideV w:val="single" w:color="auto" w:sz="4"/>
+        </w:tblBorders>
+      </w:tblPr>
+      <w:tblGrid>
+        <w:gridCol w:w="500"/>
+        <w:gridCol w:w="3800"/>
+        <w:gridCol w:w="1760"/>
+        <w:gridCol w:w="3300"/>
+      </w:tblGrid>
+      <w:tr>
+        <w:tc>
+          <w:tcPr>
+            <w:tcW w:type="dxa" w:w="500"/>
+            <w:tcBorders>
+              <w:top w:val="single" w:color="CCCCCC" w:sz="1"/>
+              <w:left w:val="single" w:color="CCCCCC" w:sz="1"/>
+              <w:bottom w:val="single" w:color="CCCCCC" w:sz="1"/>
+              <w:right w:val="single" w:color="CCCCCC" w:sz="1"/>
+            </w:tcBorders>
+            <w:shd w:fill="1A1A2E" w:val="clear"/>
+            <w:tcMar>
+              <w:top w:type="dxa" w:w="60"/>
+              <w:left w:type="dxa" w:w="100"/>
+              <w:bottom w:type="dxa" w:w="60"/>
+              <w:right w:type="dxa" w:w="100"/>
+            </w:tcMar>
+            <w:vAlign w:val="center"/>
+          </w:tcPr>
+          <w:p>
+            <w:pPr>
+              <w:jc w:val="center"/>
+            </w:pPr>
+            <w:r>
+              <w:rPr>
+                <w:rFonts w:ascii="Helvetica" w:cs="Helvetica" w:eastAsia="Helvetica" w:hAnsi="Helvetica"/>
+                <w:b/>
+                <w:bCs/>
+                <w:color w:val="FFFFFF"/>
+                <w:sz w:val="16"/>
+                <w:szCs w:val="16"/>
+              </w:rPr>
+              <w:t xml:space="preserve">#</w:t>
+            </w:r>
+          </w:p>
+        </w:tc>
+        <w:tc>
+          <w:tcPr>
+            <w:tcW w:type="dxa" w:w="3800"/>
+            <w:tcBorders>
+              <w:top w:val="single" w:color="CCCCCC" w:sz="1"/>
+              <w:left w:val="single" w:color="CCCCCC" w:sz="1"/>
+              <w:bottom w:val="single" w:color="CCCCCC" w:sz="1"/>
+              <w:right w:val="single" w:color="CCCCCC" w:sz="1"/>
+            </w:tcBorders>
+            <w:shd w:fill="1A1A2E" w:val="clear"/>
+            <w:tcMar>
+              <w:top w:type="dxa" w:w="60"/>
+              <w:left w:type="dxa" w:w="100"/>
+              <w:bottom w:type="dxa" w:w="60"/>
+              <w:right w:type="dxa" w:w="100"/>
+            </w:tcMar>
+            <w:vAlign w:val="center"/>
+          </w:tcPr>
+          <w:p>
+            <w:pPr>
+              <w:jc w:val="center"/>
+            </w:pPr>
+            <w:r>
+              <w:rPr>
+                <w:rFonts w:ascii="Helvetica" w:cs="Helvetica" w:eastAsia="Helvetica" w:hAnsi="Helvetica"/>
+                <w:b/>
+                <w:bCs/>
+                <w:color w:val="FFFFFF"/>
+                <w:sz w:val="16"/>
+                <w:szCs w:val="16"/>
+              </w:rPr>
+              <w:t xml:space="preserve">Finding</w:t>
+            </w:r>
+          </w:p>
+        </w:tc>
+        <w:tc>
+          <w:tcPr>
+            <w:tcW w:type="dxa" w:w="1760"/>
+            <w:tcBorders>
+              <w:top w:val="single" w:color="CCCCCC" w:sz="1"/>
+              <w:left w:val="single" w:color="CCCCCC" w:sz="1"/>
+              <w:bottom w:val="single" w:color="CCCCCC" w:sz="1"/>
+              <w:right w:val="single" w:color="CCCCCC" w:sz="1"/>
+            </w:tcBorders>
+            <w:shd w:fill="1A1A2E" w:val="clear"/>
+            <w:tcMar>
+              <w:top w:type="dxa" w:w="60"/>
+              <w:left w:type="dxa" w:w="100"/>
+              <w:bottom w:type="dxa" w:w="60"/>
+              <w:right w:type="dxa" w:w="100"/>
+            </w:tcMar>
+            <w:vAlign w:val="center"/>
+          </w:tcPr>
+          <w:p>
+            <w:pPr>
+              <w:jc w:val="center"/>
+            </w:pPr>
+            <w:r>
+              <w:rPr>
+                <w:rFonts w:ascii="Helvetica" w:cs="Helvetica" w:eastAsia="Helvetica" w:hAnsi="Helvetica"/>
+                <w:b/>
+                <w:bCs/>
+                <w:color w:val="FFFFFF"/>
+                <w:sz w:val="16"/>
+                <w:szCs w:val="16"/>
+              </w:rPr>
+              <w:t xml:space="preserve">Data</w:t>
+            </w:r>
+          </w:p>
+        </w:tc>
+        <w:tc>
+          <w:tcPr>
+            <w:tcW w:type="dxa" w:w="3300"/>
+            <w:tcBorders>
+              <w:top w:val="single" w:color="CCCCCC" w:sz="1"/>
+              <w:left w:val="single" w:color="CCCCCC" w:sz="1"/>
+              <w:bottom w:val="single" w:color="CCCCCC" w:sz="1"/>
+              <w:right w:val="single" w:color="CCCCCC" w:sz="1"/>
+            </w:tcBorders>
+            <w:shd w:fill="1A1A2E" w:val="clear"/>
+            <w:tcMar>
+              <w:top w:type="dxa" w:w="60"/>
+              <w:left w:type="dxa" w:w="100"/>
+              <w:bottom w:type="dxa" w:w="60"/>
+              <w:right w:type="dxa" w:w="100"/>
+            </w:tcMar>
+            <w:vAlign w:val="center"/>
+          </w:tcPr>
+          <w:p>
+            <w:pPr>
+              <w:jc w:val="center"/>
+            </w:pPr>
+            <w:r>
+              <w:rPr>
+                <w:rFonts w:ascii="Helvetica" w:cs="Helvetica" w:eastAsia="Helvetica" w:hAnsi="Helvetica"/>
+                <w:b/>
+                <w:bCs/>
+                <w:color w:val="FFFFFF"/>
+                <w:sz w:val="16"/>
+                <w:szCs w:val="16"/>
+              </w:rPr>
+              <w:t xml:space="preserve">So What</w:t>
+            </w:r>
+          </w:p>
+        </w:tc>
+      </w:tr>
+      <w:tr>
+        <w:tc>
+          <w:tcPr>
+            <w:tcW w:type="dxa" w:w="500"/>
+            <w:tcBorders>
+              <w:top w:val="single" w:color="CCCCCC" w:sz="1"/>
+              <w:left w:val="single" w:color="CCCCCC" w:sz="1"/>
+              <w:bottom w:val="single" w:color="CCCCCC" w:sz="1"/>
+              <w:right w:val="single" w:color="CCCCCC" w:sz="1"/>
+            </w:tcBorders>
+            <w:tcMar>
+              <w:top w:type="dxa" w:w="60"/>
+              <w:left w:type="dxa" w:w="100"/>
+              <w:bottom w:type="dxa" w:w="60"/>
+              <w:right w:type="dxa" w:w="100"/>
+            </w:tcMar>
+          </w:tcPr>
+          <w:p>
+            <w:pPr>
+              <w:jc w:val="center"/>
+            </w:pPr>
+            <w:r>
+              <w:rPr>
+                <w:rFonts w:ascii="Helvetica" w:cs="Helvetica" w:eastAsia="Helvetica" w:hAnsi="Helvetica"/>
+                <w:b/>
+                <w:bCs/>
                 <w:color w:val="000000"/>
                 <w:sz w:val="16"/>
                 <w:szCs w:val="16"/>
@@ -5909,40 +6551,7 @@
         </w:tc>
         <w:tc>
           <w:tcPr>
-            <w:tcW w:type="dxa" w:w="1560"/>
-            <w:tcBorders>
-              <w:top w:val="single" w:color="CCCCCC" w:sz="1"/>
-              <w:left w:val="single" w:color="CCCCCC" w:sz="1"/>
-              <w:bottom w:val="single" w:color="CCCCCC" w:sz="1"/>
-              <w:right w:val="single" w:color="CCCCCC" w:sz="1"/>
-            </w:tcBorders>
-            <w:tcMar>
-              <w:top w:type="dxa" w:w="60"/>
-              <w:left w:type="dxa" w:w="100"/>
-              <w:bottom w:type="dxa" w:w="60"/>
-              <w:right w:type="dxa" w:w="100"/>
-            </w:tcMar>
-          </w:tcPr>
-          <w:p>
-            <w:pPr>
-              <w:jc w:val="center"/>
-            </w:pPr>
-            <w:r>
-              <w:rPr>
-                <w:rFonts w:ascii="Helvetica" w:cs="Helvetica" w:eastAsia="Helvetica" w:hAnsi="Helvetica"/>
-                <w:b w:val="false"/>
-                <w:bCs w:val="false"/>
-                <w:color w:val="000000"/>
-                <w:sz w:val="16"/>
-                <w:szCs w:val="16"/>
-              </w:rPr>
-              <w:t xml:space="preserve">0.2%</w:t>
-            </w:r>
-          </w:p>
-        </w:tc>
-        <w:tc>
-          <w:tcPr>
-            <w:tcW w:type="dxa" w:w="2400"/>
+            <w:tcW w:type="dxa" w:w="3800"/>
             <w:tcBorders>
               <w:top w:val="single" w:color="CCCCCC" w:sz="1"/>
               <w:left w:val="single" w:color="CCCCCC" w:sz="1"/>
@@ -5965,11 +6574,479 @@
                 <w:rFonts w:ascii="Helvetica" w:cs="Helvetica" w:eastAsia="Helvetica" w:hAnsi="Helvetica"/>
                 <w:b w:val="false"/>
                 <w:bCs w:val="false"/>
+                <w:color w:val="000000"/>
+                <w:sz w:val="16"/>
+                <w:szCs w:val="16"/>
+              </w:rPr>
+              <w:t xml:space="preserve">55% of hangups happen during the pitch</w:t>
+            </w:r>
+          </w:p>
+        </w:tc>
+        <w:tc>
+          <w:tcPr>
+            <w:tcW w:type="dxa" w:w="1760"/>
+            <w:tcBorders>
+              <w:top w:val="single" w:color="CCCCCC" w:sz="1"/>
+              <w:left w:val="single" w:color="CCCCCC" w:sz="1"/>
+              <w:bottom w:val="single" w:color="CCCCCC" w:sz="1"/>
+              <w:right w:val="single" w:color="CCCCCC" w:sz="1"/>
+            </w:tcBorders>
+            <w:tcMar>
+              <w:top w:type="dxa" w:w="60"/>
+              <w:left w:type="dxa" w:w="100"/>
+              <w:bottom w:type="dxa" w:w="60"/>
+              <w:right w:type="dxa" w:w="100"/>
+            </w:tcMar>
+          </w:tcPr>
+          <w:p>
+            <w:pPr>
+              <w:jc w:val="center"/>
+            </w:pPr>
+            <w:r>
+              <w:rPr>
+                <w:rFonts w:ascii="Helvetica" w:cs="Helvetica" w:eastAsia="Helvetica" w:hAnsi="Helvetica"/>
+                <w:b/>
+                <w:bCs/>
+                <w:color w:val="000000"/>
+                <w:sz w:val="16"/>
+                <w:szCs w:val="16"/>
+              </w:rPr>
+              <w:t xml:space="preserve">128/231</w:t>
+            </w:r>
+          </w:p>
+        </w:tc>
+        <w:tc>
+          <w:tcPr>
+            <w:tcW w:type="dxa" w:w="3300"/>
+            <w:tcBorders>
+              <w:top w:val="single" w:color="CCCCCC" w:sz="1"/>
+              <w:left w:val="single" w:color="CCCCCC" w:sz="1"/>
+              <w:bottom w:val="single" w:color="CCCCCC" w:sz="1"/>
+              <w:right w:val="single" w:color="CCCCCC" w:sz="1"/>
+            </w:tcBorders>
+            <w:tcMar>
+              <w:top w:type="dxa" w:w="60"/>
+              <w:left w:type="dxa" w:w="100"/>
+              <w:bottom w:type="dxa" w:w="60"/>
+              <w:right w:type="dxa" w:w="100"/>
+            </w:tcMar>
+          </w:tcPr>
+          <w:p>
+            <w:pPr>
+              <w:jc w:val="left"/>
+            </w:pPr>
+            <w:r>
+              <w:rPr>
+                <w:rFonts w:ascii="Helvetica" w:cs="Helvetica" w:eastAsia="Helvetica" w:hAnsi="Helvetica"/>
+                <w:b w:val="false"/>
+                <w:bCs w:val="false"/>
                 <w:color w:val="666666"/>
                 <w:sz w:val="16"/>
                 <w:szCs w:val="16"/>
               </w:rPr>
-              <w:t xml:space="preserve"/>
+              <w:t xml:space="preserve">Pitch is where we lose people</w:t>
+            </w:r>
+          </w:p>
+        </w:tc>
+      </w:tr>
+      <w:tr>
+        <w:tc>
+          <w:tcPr>
+            <w:tcW w:type="dxa" w:w="500"/>
+            <w:tcBorders>
+              <w:top w:val="single" w:color="CCCCCC" w:sz="1"/>
+              <w:left w:val="single" w:color="CCCCCC" w:sz="1"/>
+              <w:bottom w:val="single" w:color="CCCCCC" w:sz="1"/>
+              <w:right w:val="single" w:color="CCCCCC" w:sz="1"/>
+            </w:tcBorders>
+            <w:tcMar>
+              <w:top w:type="dxa" w:w="60"/>
+              <w:left w:type="dxa" w:w="100"/>
+              <w:bottom w:type="dxa" w:w="60"/>
+              <w:right w:type="dxa" w:w="100"/>
+            </w:tcMar>
+          </w:tcPr>
+          <w:p>
+            <w:pPr>
+              <w:jc w:val="center"/>
+            </w:pPr>
+            <w:r>
+              <w:rPr>
+                <w:rFonts w:ascii="Helvetica" w:cs="Helvetica" w:eastAsia="Helvetica" w:hAnsi="Helvetica"/>
+                <w:b/>
+                <w:bCs/>
+                <w:color w:val="000000"/>
+                <w:sz w:val="16"/>
+                <w:szCs w:val="16"/>
+              </w:rPr>
+              <w:t xml:space="preserve">2</w:t>
+            </w:r>
+          </w:p>
+        </w:tc>
+        <w:tc>
+          <w:tcPr>
+            <w:tcW w:type="dxa" w:w="3800"/>
+            <w:tcBorders>
+              <w:top w:val="single" w:color="CCCCCC" w:sz="1"/>
+              <w:left w:val="single" w:color="CCCCCC" w:sz="1"/>
+              <w:bottom w:val="single" w:color="CCCCCC" w:sz="1"/>
+              <w:right w:val="single" w:color="CCCCCC" w:sz="1"/>
+            </w:tcBorders>
+            <w:tcMar>
+              <w:top w:type="dxa" w:w="60"/>
+              <w:left w:type="dxa" w:w="100"/>
+              <w:bottom w:type="dxa" w:w="60"/>
+              <w:right w:type="dxa" w:w="100"/>
+            </w:tcMar>
+          </w:tcPr>
+          <w:p>
+            <w:pPr>
+              <w:jc w:val="left"/>
+            </w:pPr>
+            <w:r>
+              <w:rPr>
+                <w:rFonts w:ascii="Helvetica" w:cs="Helvetica" w:eastAsia="Helvetica" w:hAnsi="Helvetica"/>
+                <w:b w:val="false"/>
+                <w:bCs w:val="false"/>
+                <w:color w:val="000000"/>
+                <w:sz w:val="16"/>
+                <w:szCs w:val="16"/>
+              </w:rPr>
+              <w:t xml:space="preserve">55% of members just say “Hello?” to the pitch</w:t>
+            </w:r>
+          </w:p>
+        </w:tc>
+        <w:tc>
+          <w:tcPr>
+            <w:tcW w:type="dxa" w:w="1760"/>
+            <w:tcBorders>
+              <w:top w:val="single" w:color="CCCCCC" w:sz="1"/>
+              <w:left w:val="single" w:color="CCCCCC" w:sz="1"/>
+              <w:bottom w:val="single" w:color="CCCCCC" w:sz="1"/>
+              <w:right w:val="single" w:color="CCCCCC" w:sz="1"/>
+            </w:tcBorders>
+            <w:tcMar>
+              <w:top w:type="dxa" w:w="60"/>
+              <w:left w:type="dxa" w:w="100"/>
+              <w:bottom w:type="dxa" w:w="60"/>
+              <w:right w:type="dxa" w:w="100"/>
+            </w:tcMar>
+          </w:tcPr>
+          <w:p>
+            <w:pPr>
+              <w:jc w:val="center"/>
+            </w:pPr>
+            <w:r>
+              <w:rPr>
+                <w:rFonts w:ascii="Helvetica" w:cs="Helvetica" w:eastAsia="Helvetica" w:hAnsi="Helvetica"/>
+                <w:b/>
+                <w:bCs/>
+                <w:color w:val="000000"/>
+                <w:sz w:val="16"/>
+                <w:szCs w:val="16"/>
+              </w:rPr>
+              <w:t xml:space="preserve">96/173</w:t>
+            </w:r>
+          </w:p>
+        </w:tc>
+        <w:tc>
+          <w:tcPr>
+            <w:tcW w:type="dxa" w:w="3300"/>
+            <w:tcBorders>
+              <w:top w:val="single" w:color="CCCCCC" w:sz="1"/>
+              <w:left w:val="single" w:color="CCCCCC" w:sz="1"/>
+              <w:bottom w:val="single" w:color="CCCCCC" w:sz="1"/>
+              <w:right w:val="single" w:color="CCCCCC" w:sz="1"/>
+            </w:tcBorders>
+            <w:tcMar>
+              <w:top w:type="dxa" w:w="60"/>
+              <w:left w:type="dxa" w:w="100"/>
+              <w:bottom w:type="dxa" w:w="60"/>
+              <w:right w:type="dxa" w:w="100"/>
+            </w:tcMar>
+          </w:tcPr>
+          <w:p>
+            <w:pPr>
+              <w:jc w:val="left"/>
+            </w:pPr>
+            <w:r>
+              <w:rPr>
+                <w:rFonts w:ascii="Helvetica" w:cs="Helvetica" w:eastAsia="Helvetica" w:hAnsi="Helvetica"/>
+                <w:b w:val="false"/>
+                <w:bCs w:val="false"/>
+                <w:color w:val="666666"/>
+                <w:sz w:val="16"/>
+                <w:szCs w:val="16"/>
+              </w:rPr>
+              <w:t xml:space="preserve">Pitch fires before they’re ready to listen</w:t>
+            </w:r>
+          </w:p>
+        </w:tc>
+      </w:tr>
+      <w:tr>
+        <w:tc>
+          <w:tcPr>
+            <w:tcW w:type="dxa" w:w="500"/>
+            <w:tcBorders>
+              <w:top w:val="single" w:color="CCCCCC" w:sz="1"/>
+              <w:left w:val="single" w:color="CCCCCC" w:sz="1"/>
+              <w:bottom w:val="single" w:color="CCCCCC" w:sz="1"/>
+              <w:right w:val="single" w:color="CCCCCC" w:sz="1"/>
+            </w:tcBorders>
+            <w:tcMar>
+              <w:top w:type="dxa" w:w="60"/>
+              <w:left w:type="dxa" w:w="100"/>
+              <w:bottom w:type="dxa" w:w="60"/>
+              <w:right w:type="dxa" w:w="100"/>
+            </w:tcMar>
+          </w:tcPr>
+          <w:p>
+            <w:pPr>
+              <w:jc w:val="center"/>
+            </w:pPr>
+            <w:r>
+              <w:rPr>
+                <w:rFonts w:ascii="Helvetica" w:cs="Helvetica" w:eastAsia="Helvetica" w:hAnsi="Helvetica"/>
+                <w:b/>
+                <w:bCs/>
+                <w:color w:val="000000"/>
+                <w:sz w:val="16"/>
+                <w:szCs w:val="16"/>
+              </w:rPr>
+              <w:t xml:space="preserve">3</w:t>
+            </w:r>
+          </w:p>
+        </w:tc>
+        <w:tc>
+          <w:tcPr>
+            <w:tcW w:type="dxa" w:w="3800"/>
+            <w:tcBorders>
+              <w:top w:val="single" w:color="CCCCCC" w:sz="1"/>
+              <w:left w:val="single" w:color="CCCCCC" w:sz="1"/>
+              <w:bottom w:val="single" w:color="CCCCCC" w:sz="1"/>
+              <w:right w:val="single" w:color="CCCCCC" w:sz="1"/>
+            </w:tcBorders>
+            <w:tcMar>
+              <w:top w:type="dxa" w:w="60"/>
+              <w:left w:type="dxa" w:w="100"/>
+              <w:bottom w:type="dxa" w:w="60"/>
+              <w:right w:type="dxa" w:w="100"/>
+            </w:tcMar>
+          </w:tcPr>
+          <w:p>
+            <w:pPr>
+              <w:jc w:val="left"/>
+            </w:pPr>
+            <w:r>
+              <w:rPr>
+                <w:rFonts w:ascii="Helvetica" w:cs="Helvetica" w:eastAsia="Helvetica" w:hAnsi="Helvetica"/>
+                <w:b w:val="false"/>
+                <w:bCs w:val="false"/>
+                <w:color w:val="000000"/>
+                <w:sz w:val="16"/>
+                <w:szCs w:val="16"/>
+              </w:rPr>
+              <w:t xml:space="preserve">After “Hello?”, agent plays disclaimer 68% of time</w:t>
+            </w:r>
+          </w:p>
+        </w:tc>
+        <w:tc>
+          <w:tcPr>
+            <w:tcW w:type="dxa" w:w="1760"/>
+            <w:tcBorders>
+              <w:top w:val="single" w:color="CCCCCC" w:sz="1"/>
+              <w:left w:val="single" w:color="CCCCCC" w:sz="1"/>
+              <w:bottom w:val="single" w:color="CCCCCC" w:sz="1"/>
+              <w:right w:val="single" w:color="CCCCCC" w:sz="1"/>
+            </w:tcBorders>
+            <w:tcMar>
+              <w:top w:type="dxa" w:w="60"/>
+              <w:left w:type="dxa" w:w="100"/>
+              <w:bottom w:type="dxa" w:w="60"/>
+              <w:right w:type="dxa" w:w="100"/>
+            </w:tcMar>
+          </w:tcPr>
+          <w:p>
+            <w:pPr>
+              <w:jc w:val="center"/>
+            </w:pPr>
+            <w:r>
+              <w:rPr>
+                <w:rFonts w:ascii="Helvetica" w:cs="Helvetica" w:eastAsia="Helvetica" w:hAnsi="Helvetica"/>
+                <w:b/>
+                <w:bCs/>
+                <w:color w:val="000000"/>
+                <w:sz w:val="16"/>
+                <w:szCs w:val="16"/>
+              </w:rPr>
+              <w:t xml:space="preserve">84/124</w:t>
+            </w:r>
+          </w:p>
+        </w:tc>
+        <w:tc>
+          <w:tcPr>
+            <w:tcW w:type="dxa" w:w="3300"/>
+            <w:tcBorders>
+              <w:top w:val="single" w:color="CCCCCC" w:sz="1"/>
+              <w:left w:val="single" w:color="CCCCCC" w:sz="1"/>
+              <w:bottom w:val="single" w:color="CCCCCC" w:sz="1"/>
+              <w:right w:val="single" w:color="CCCCCC" w:sz="1"/>
+            </w:tcBorders>
+            <w:tcMar>
+              <w:top w:type="dxa" w:w="60"/>
+              <w:left w:type="dxa" w:w="100"/>
+              <w:bottom w:type="dxa" w:w="60"/>
+              <w:right w:type="dxa" w:w="100"/>
+            </w:tcMar>
+          </w:tcPr>
+          <w:p>
+            <w:pPr>
+              <w:jc w:val="left"/>
+            </w:pPr>
+            <w:r>
+              <w:rPr>
+                <w:rFonts w:ascii="Helvetica" w:cs="Helvetica" w:eastAsia="Helvetica" w:hAnsi="Helvetica"/>
+                <w:b w:val="false"/>
+                <w:bCs w:val="false"/>
+                <w:color w:val="666666"/>
+                <w:sz w:val="16"/>
+                <w:szCs w:val="16"/>
+              </w:rPr>
+              <w:t xml:space="preserve">Should greet them first</w:t>
+            </w:r>
+          </w:p>
+        </w:tc>
+      </w:tr>
+      <w:tr>
+        <w:tc>
+          <w:tcPr>
+            <w:tcW w:type="dxa" w:w="500"/>
+            <w:tcBorders>
+              <w:top w:val="single" w:color="CCCCCC" w:sz="1"/>
+              <w:left w:val="single" w:color="CCCCCC" w:sz="1"/>
+              <w:bottom w:val="single" w:color="CCCCCC" w:sz="1"/>
+              <w:right w:val="single" w:color="CCCCCC" w:sz="1"/>
+            </w:tcBorders>
+            <w:tcMar>
+              <w:top w:type="dxa" w:w="60"/>
+              <w:left w:type="dxa" w:w="100"/>
+              <w:bottom w:type="dxa" w:w="60"/>
+              <w:right w:type="dxa" w:w="100"/>
+            </w:tcMar>
+          </w:tcPr>
+          <w:p>
+            <w:pPr>
+              <w:jc w:val="center"/>
+            </w:pPr>
+            <w:r>
+              <w:rPr>
+                <w:rFonts w:ascii="Helvetica" w:cs="Helvetica" w:eastAsia="Helvetica" w:hAnsi="Helvetica"/>
+                <w:b/>
+                <w:bCs/>
+                <w:color w:val="000000"/>
+                <w:sz w:val="16"/>
+                <w:szCs w:val="16"/>
+              </w:rPr>
+              <w:t xml:space="preserve">4</w:t>
+            </w:r>
+          </w:p>
+        </w:tc>
+        <w:tc>
+          <w:tcPr>
+            <w:tcW w:type="dxa" w:w="3800"/>
+            <w:tcBorders>
+              <w:top w:val="single" w:color="CCCCCC" w:sz="1"/>
+              <w:left w:val="single" w:color="CCCCCC" w:sz="1"/>
+              <w:bottom w:val="single" w:color="CCCCCC" w:sz="1"/>
+              <w:right w:val="single" w:color="CCCCCC" w:sz="1"/>
+            </w:tcBorders>
+            <w:tcMar>
+              <w:top w:type="dxa" w:w="60"/>
+              <w:left w:type="dxa" w:w="100"/>
+              <w:bottom w:type="dxa" w:w="60"/>
+              <w:right w:type="dxa" w:w="100"/>
+            </w:tcMar>
+          </w:tcPr>
+          <w:p>
+            <w:pPr>
+              <w:jc w:val="left"/>
+            </w:pPr>
+            <w:r>
+              <w:rPr>
+                <w:rFonts w:ascii="Helvetica" w:cs="Helvetica" w:eastAsia="Helvetica" w:hAnsi="Helvetica"/>
+                <w:b w:val="false"/>
+                <w:bCs w:val="false"/>
+                <w:color w:val="000000"/>
+                <w:sz w:val="16"/>
+                <w:szCs w:val="16"/>
+              </w:rPr>
+              <w:t xml:space="preserve">47% of short calls: member says hi, then hangs up</w:t>
+            </w:r>
+          </w:p>
+        </w:tc>
+        <w:tc>
+          <w:tcPr>
+            <w:tcW w:type="dxa" w:w="1760"/>
+            <w:tcBorders>
+              <w:top w:val="single" w:color="CCCCCC" w:sz="1"/>
+              <w:left w:val="single" w:color="CCCCCC" w:sz="1"/>
+              <w:bottom w:val="single" w:color="CCCCCC" w:sz="1"/>
+              <w:right w:val="single" w:color="CCCCCC" w:sz="1"/>
+            </w:tcBorders>
+            <w:tcMar>
+              <w:top w:type="dxa" w:w="60"/>
+              <w:left w:type="dxa" w:w="100"/>
+              <w:bottom w:type="dxa" w:w="60"/>
+              <w:right w:type="dxa" w:w="100"/>
+            </w:tcMar>
+          </w:tcPr>
+          <w:p>
+            <w:pPr>
+              <w:jc w:val="center"/>
+            </w:pPr>
+            <w:r>
+              <w:rPr>
+                <w:rFonts w:ascii="Helvetica" w:cs="Helvetica" w:eastAsia="Helvetica" w:hAnsi="Helvetica"/>
+                <w:b/>
+                <w:bCs/>
+                <w:color w:val="000000"/>
+                <w:sz w:val="16"/>
+                <w:szCs w:val="16"/>
+              </w:rPr>
+              <w:t xml:space="preserve">87/184</w:t>
+            </w:r>
+          </w:p>
+        </w:tc>
+        <w:tc>
+          <w:tcPr>
+            <w:tcW w:type="dxa" w:w="3300"/>
+            <w:tcBorders>
+              <w:top w:val="single" w:color="CCCCCC" w:sz="1"/>
+              <w:left w:val="single" w:color="CCCCCC" w:sz="1"/>
+              <w:bottom w:val="single" w:color="CCCCCC" w:sz="1"/>
+              <w:right w:val="single" w:color="CCCCCC" w:sz="1"/>
+            </w:tcBorders>
+            <w:tcMar>
+              <w:top w:type="dxa" w:w="60"/>
+              <w:left w:type="dxa" w:w="100"/>
+              <w:bottom w:type="dxa" w:w="60"/>
+              <w:right w:type="dxa" w:w="100"/>
+            </w:tcMar>
+          </w:tcPr>
+          <w:p>
+            <w:pPr>
+              <w:jc w:val="left"/>
+            </w:pPr>
+            <w:r>
+              <w:rPr>
+                <w:rFonts w:ascii="Helvetica" w:cs="Helvetica" w:eastAsia="Helvetica" w:hAnsi="Helvetica"/>
+                <w:b w:val="false"/>
+                <w:bCs w:val="false"/>
+                <w:color w:val="666666"/>
+                <w:sz w:val="16"/>
+                <w:szCs w:val="16"/>
+              </w:rPr>
+              <w:t xml:space="preserve">Opening doesn’t hook them fast enough</w:t>
             </w:r>
           </w:p>
         </w:tc>
@@ -5991,1694 +7068,7 @@
           <w:bCs/>
           <w:color w:val="1A1A2E"/>
         </w:rPr>
-        <w:t xml:space="preserve">4. Root Cause Analysis</w:t>
-      </w:r>
-    </w:p>
-    <w:p>
-      <w:pPr>
-        <w:spacing w:after="100"/>
-      </w:pPr>
-      <w:r>
-        <w:rPr>
-          <w:rFonts w:ascii="Helvetica" w:cs="Helvetica" w:eastAsia="Helvetica" w:hAnsi="Helvetica"/>
-          <w:b w:val="false"/>
-          <w:bCs w:val="false"/>
-          <w:color w:val="000000"/>
-          <w:sz w:val="18"/>
-          <w:szCs w:val="18"/>
-        </w:rPr>
-        <w:t xml:space="preserve">Dialog act classification applied to every turn in every spoke_to call. Each turn tagged as a specific act (pitch, greeting, disclaimer, question, etc.) and the sequence analyzed for structural failure patterns.</w:t>
-      </w:r>
-    </w:p>
-    <w:p>
-      <w:pPr>
-        <w:spacing w:after="80" w:before="80"/>
-      </w:pPr>
-    </w:p>
-    <w:p>
-      <w:pPr>
-        <w:pStyle w:val="Heading3"/>
-      </w:pPr>
-      <w:r>
-        <w:rPr>
-          <w:rFonts w:ascii="Helvetica" w:cs="Helvetica" w:eastAsia="Helvetica" w:hAnsi="Helvetica"/>
-          <w:b/>
-          <w:bCs/>
-          <w:color w:val="1A1A2E"/>
-        </w:rPr>
-        <w:t xml:space="preserve">Dominant Failure Flow</w:t>
-      </w:r>
-    </w:p>
-    <w:p>
-      <w:pPr>
-        <w:spacing w:after="60"/>
-      </w:pPr>
-      <w:r>
-        <w:rPr>
-          <w:rFonts w:ascii="Helvetica" w:cs="Helvetica" w:eastAsia="Helvetica" w:hAnsi="Helvetica"/>
-          <w:b/>
-          <w:bCs/>
-          <w:color w:val="CC0000"/>
-          <w:sz w:val="20"/>
-          <w:szCs w:val="20"/>
-        </w:rPr>
-        <w:t xml:space="preserve">AGT:pitch → MBR:greeting → AGT:disclaimer → AGT:pitch</w:t>
-      </w:r>
-    </w:p>
-    <w:p>
-      <w:pPr>
-        <w:spacing w:after="100"/>
-      </w:pPr>
-      <w:r>
-        <w:rPr>
-          <w:rFonts w:ascii="Helvetica" w:cs="Helvetica" w:eastAsia="Helvetica" w:hAnsi="Helvetica"/>
-          <w:b w:val="false"/>
-          <w:bCs w:val="false"/>
-          <w:color w:val="000000"/>
-          <w:sz w:val="18"/>
-          <w:szCs w:val="18"/>
-        </w:rPr>
-        <w:t xml:space="preserve">Frequency: 41x (20.4% of all failures). Agent leads with pitch before member is ready, member says “Hello?”, agent plays disclaimer, then repeats the same pitch. Member hangs up after hearing the pitch twice.</w:t>
-      </w:r>
-    </w:p>
-    <w:p>
-      <w:pPr>
-        <w:spacing w:after="80" w:before="80"/>
-      </w:pPr>
-    </w:p>
-    <w:p>
-      <w:pPr>
-        <w:pStyle w:val="Heading3"/>
-      </w:pPr>
-      <w:r>
-        <w:rPr>
-          <w:rFonts w:ascii="Helvetica" w:cs="Helvetica" w:eastAsia="Helvetica" w:hAnsi="Helvetica"/>
-          <w:b/>
-          <w:bCs/>
-          <w:color w:val="1A1A2E"/>
-        </w:rPr>
-        <w:t xml:space="preserve">Key Findings</w:t>
-      </w:r>
-    </w:p>
-    <w:tbl>
-      <w:tblPr>
-        <w:tblW w:type="dxa" w:w="9360"/>
-        <w:tblBorders>
-          <w:top w:val="single" w:color="auto" w:sz="4"/>
-          <w:left w:val="single" w:color="auto" w:sz="4"/>
-          <w:bottom w:val="single" w:color="auto" w:sz="4"/>
-          <w:right w:val="single" w:color="auto" w:sz="4"/>
-          <w:insideH w:val="single" w:color="auto" w:sz="4"/>
-          <w:insideV w:val="single" w:color="auto" w:sz="4"/>
-        </w:tblBorders>
-      </w:tblPr>
-      <w:tblGrid>
-        <w:gridCol w:w="500"/>
-        <w:gridCol w:w="3200"/>
-        <w:gridCol w:w="2260"/>
-        <w:gridCol w:w="3400"/>
-      </w:tblGrid>
-      <w:tr>
-        <w:tc>
-          <w:tcPr>
-            <w:tcW w:type="dxa" w:w="500"/>
-            <w:tcBorders>
-              <w:top w:val="single" w:color="CCCCCC" w:sz="1"/>
-              <w:left w:val="single" w:color="CCCCCC" w:sz="1"/>
-              <w:bottom w:val="single" w:color="CCCCCC" w:sz="1"/>
-              <w:right w:val="single" w:color="CCCCCC" w:sz="1"/>
-            </w:tcBorders>
-            <w:shd w:fill="1A1A2E" w:val="clear"/>
-            <w:tcMar>
-              <w:top w:type="dxa" w:w="60"/>
-              <w:left w:type="dxa" w:w="100"/>
-              <w:bottom w:type="dxa" w:w="60"/>
-              <w:right w:type="dxa" w:w="100"/>
-            </w:tcMar>
-            <w:vAlign w:val="center"/>
-          </w:tcPr>
-          <w:p>
-            <w:pPr>
-              <w:jc w:val="center"/>
-            </w:pPr>
-            <w:r>
-              <w:rPr>
-                <w:rFonts w:ascii="Helvetica" w:cs="Helvetica" w:eastAsia="Helvetica" w:hAnsi="Helvetica"/>
-                <w:b/>
-                <w:bCs/>
-                <w:color w:val="FFFFFF"/>
-                <w:sz w:val="16"/>
-                <w:szCs w:val="16"/>
-              </w:rPr>
-              <w:t xml:space="preserve">#</w:t>
-            </w:r>
-          </w:p>
-        </w:tc>
-        <w:tc>
-          <w:tcPr>
-            <w:tcW w:type="dxa" w:w="3200"/>
-            <w:tcBorders>
-              <w:top w:val="single" w:color="CCCCCC" w:sz="1"/>
-              <w:left w:val="single" w:color="CCCCCC" w:sz="1"/>
-              <w:bottom w:val="single" w:color="CCCCCC" w:sz="1"/>
-              <w:right w:val="single" w:color="CCCCCC" w:sz="1"/>
-            </w:tcBorders>
-            <w:shd w:fill="1A1A2E" w:val="clear"/>
-            <w:tcMar>
-              <w:top w:type="dxa" w:w="60"/>
-              <w:left w:type="dxa" w:w="100"/>
-              <w:bottom w:type="dxa" w:w="60"/>
-              <w:right w:type="dxa" w:w="100"/>
-            </w:tcMar>
-            <w:vAlign w:val="center"/>
-          </w:tcPr>
-          <w:p>
-            <w:pPr>
-              <w:jc w:val="center"/>
-            </w:pPr>
-            <w:r>
-              <w:rPr>
-                <w:rFonts w:ascii="Helvetica" w:cs="Helvetica" w:eastAsia="Helvetica" w:hAnsi="Helvetica"/>
-                <w:b/>
-                <w:bCs/>
-                <w:color w:val="FFFFFF"/>
-                <w:sz w:val="16"/>
-                <w:szCs w:val="16"/>
-              </w:rPr>
-              <w:t xml:space="preserve">Finding</w:t>
-            </w:r>
-          </w:p>
-        </w:tc>
-        <w:tc>
-          <w:tcPr>
-            <w:tcW w:type="dxa" w:w="2260"/>
-            <w:tcBorders>
-              <w:top w:val="single" w:color="CCCCCC" w:sz="1"/>
-              <w:left w:val="single" w:color="CCCCCC" w:sz="1"/>
-              <w:bottom w:val="single" w:color="CCCCCC" w:sz="1"/>
-              <w:right w:val="single" w:color="CCCCCC" w:sz="1"/>
-            </w:tcBorders>
-            <w:shd w:fill="1A1A2E" w:val="clear"/>
-            <w:tcMar>
-              <w:top w:type="dxa" w:w="60"/>
-              <w:left w:type="dxa" w:w="100"/>
-              <w:bottom w:type="dxa" w:w="60"/>
-              <w:right w:type="dxa" w:w="100"/>
-            </w:tcMar>
-            <w:vAlign w:val="center"/>
-          </w:tcPr>
-          <w:p>
-            <w:pPr>
-              <w:jc w:val="center"/>
-            </w:pPr>
-            <w:r>
-              <w:rPr>
-                <w:rFonts w:ascii="Helvetica" w:cs="Helvetica" w:eastAsia="Helvetica" w:hAnsi="Helvetica"/>
-                <w:b/>
-                <w:bCs/>
-                <w:color w:val="FFFFFF"/>
-                <w:sz w:val="16"/>
-                <w:szCs w:val="16"/>
-              </w:rPr>
-              <w:t xml:space="preserve">Data</w:t>
-            </w:r>
-          </w:p>
-        </w:tc>
-        <w:tc>
-          <w:tcPr>
-            <w:tcW w:type="dxa" w:w="3400"/>
-            <w:tcBorders>
-              <w:top w:val="single" w:color="CCCCCC" w:sz="1"/>
-              <w:left w:val="single" w:color="CCCCCC" w:sz="1"/>
-              <w:bottom w:val="single" w:color="CCCCCC" w:sz="1"/>
-              <w:right w:val="single" w:color="CCCCCC" w:sz="1"/>
-            </w:tcBorders>
-            <w:shd w:fill="1A1A2E" w:val="clear"/>
-            <w:tcMar>
-              <w:top w:type="dxa" w:w="60"/>
-              <w:left w:type="dxa" w:w="100"/>
-              <w:bottom w:type="dxa" w:w="60"/>
-              <w:right w:type="dxa" w:w="100"/>
-            </w:tcMar>
-            <w:vAlign w:val="center"/>
-          </w:tcPr>
-          <w:p>
-            <w:pPr>
-              <w:jc w:val="center"/>
-            </w:pPr>
-            <w:r>
-              <w:rPr>
-                <w:rFonts w:ascii="Helvetica" w:cs="Helvetica" w:eastAsia="Helvetica" w:hAnsi="Helvetica"/>
-                <w:b/>
-                <w:bCs/>
-                <w:color w:val="FFFFFF"/>
-                <w:sz w:val="16"/>
-                <w:szCs w:val="16"/>
-              </w:rPr>
-              <w:t xml:space="preserve">Implication</w:t>
-            </w:r>
-          </w:p>
-        </w:tc>
-      </w:tr>
-      <w:tr>
-        <w:tc>
-          <w:tcPr>
-            <w:tcW w:type="dxa" w:w="500"/>
-            <w:tcBorders>
-              <w:top w:val="single" w:color="CCCCCC" w:sz="1"/>
-              <w:left w:val="single" w:color="CCCCCC" w:sz="1"/>
-              <w:bottom w:val="single" w:color="CCCCCC" w:sz="1"/>
-              <w:right w:val="single" w:color="CCCCCC" w:sz="1"/>
-            </w:tcBorders>
-            <w:tcMar>
-              <w:top w:type="dxa" w:w="60"/>
-              <w:left w:type="dxa" w:w="100"/>
-              <w:bottom w:type="dxa" w:w="60"/>
-              <w:right w:type="dxa" w:w="100"/>
-            </w:tcMar>
-          </w:tcPr>
-          <w:p>
-            <w:pPr>
-              <w:jc w:val="center"/>
-            </w:pPr>
-            <w:r>
-              <w:rPr>
-                <w:rFonts w:ascii="Helvetica" w:cs="Helvetica" w:eastAsia="Helvetica" w:hAnsi="Helvetica"/>
-                <w:b/>
-                <w:bCs/>
-                <w:color w:val="000000"/>
-                <w:sz w:val="16"/>
-                <w:szCs w:val="16"/>
-              </w:rPr>
-              <w:t xml:space="preserve">1</w:t>
-            </w:r>
-          </w:p>
-        </w:tc>
-        <w:tc>
-          <w:tcPr>
-            <w:tcW w:type="dxa" w:w="3200"/>
-            <w:tcBorders>
-              <w:top w:val="single" w:color="CCCCCC" w:sz="1"/>
-              <w:left w:val="single" w:color="CCCCCC" w:sz="1"/>
-              <w:bottom w:val="single" w:color="CCCCCC" w:sz="1"/>
-              <w:right w:val="single" w:color="CCCCCC" w:sz="1"/>
-            </w:tcBorders>
-            <w:tcMar>
-              <w:top w:type="dxa" w:w="60"/>
-              <w:left w:type="dxa" w:w="100"/>
-              <w:bottom w:type="dxa" w:w="60"/>
-              <w:right w:type="dxa" w:w="100"/>
-            </w:tcMar>
-          </w:tcPr>
-          <w:p>
-            <w:pPr>
-              <w:jc w:val="left"/>
-            </w:pPr>
-            <w:r>
-              <w:rPr>
-                <w:rFonts w:ascii="Helvetica" w:cs="Helvetica" w:eastAsia="Helvetica" w:hAnsi="Helvetica"/>
-                <w:b w:val="false"/>
-                <w:bCs w:val="false"/>
-                <w:color w:val="000000"/>
-                <w:sz w:val="16"/>
-                <w:szCs w:val="16"/>
-              </w:rPr>
-              <w:t xml:space="preserve">55.4% of hangups occur during AGT:pitch</w:t>
-            </w:r>
-          </w:p>
-        </w:tc>
-        <w:tc>
-          <w:tcPr>
-            <w:tcW w:type="dxa" w:w="2260"/>
-            <w:tcBorders>
-              <w:top w:val="single" w:color="CCCCCC" w:sz="1"/>
-              <w:left w:val="single" w:color="CCCCCC" w:sz="1"/>
-              <w:bottom w:val="single" w:color="CCCCCC" w:sz="1"/>
-              <w:right w:val="single" w:color="CCCCCC" w:sz="1"/>
-            </w:tcBorders>
-            <w:tcMar>
-              <w:top w:type="dxa" w:w="60"/>
-              <w:left w:type="dxa" w:w="100"/>
-              <w:bottom w:type="dxa" w:w="60"/>
-              <w:right w:type="dxa" w:w="100"/>
-            </w:tcMar>
-          </w:tcPr>
-          <w:p>
-            <w:pPr>
-              <w:jc w:val="center"/>
-            </w:pPr>
-            <w:r>
-              <w:rPr>
-                <w:rFonts w:ascii="Helvetica" w:cs="Helvetica" w:eastAsia="Helvetica" w:hAnsi="Helvetica"/>
-                <w:b/>
-                <w:bCs/>
-                <w:color w:val="000000"/>
-                <w:sz w:val="16"/>
-                <w:szCs w:val="16"/>
-              </w:rPr>
-              <w:t xml:space="preserve">128/231</w:t>
-            </w:r>
-          </w:p>
-        </w:tc>
-        <w:tc>
-          <w:tcPr>
-            <w:tcW w:type="dxa" w:w="3400"/>
-            <w:tcBorders>
-              <w:top w:val="single" w:color="CCCCCC" w:sz="1"/>
-              <w:left w:val="single" w:color="CCCCCC" w:sz="1"/>
-              <w:bottom w:val="single" w:color="CCCCCC" w:sz="1"/>
-              <w:right w:val="single" w:color="CCCCCC" w:sz="1"/>
-            </w:tcBorders>
-            <w:tcMar>
-              <w:top w:type="dxa" w:w="60"/>
-              <w:left w:type="dxa" w:w="100"/>
-              <w:bottom w:type="dxa" w:w="60"/>
-              <w:right w:type="dxa" w:w="100"/>
-            </w:tcMar>
-          </w:tcPr>
-          <w:p>
-            <w:pPr>
-              <w:jc w:val="left"/>
-            </w:pPr>
-            <w:r>
-              <w:rPr>
-                <w:rFonts w:ascii="Helvetica" w:cs="Helvetica" w:eastAsia="Helvetica" w:hAnsi="Helvetica"/>
-                <w:b w:val="false"/>
-                <w:bCs w:val="false"/>
-                <w:color w:val="666666"/>
-                <w:sz w:val="16"/>
-                <w:szCs w:val="16"/>
-              </w:rPr>
-              <w:t xml:space="preserve">The pitch is the dropout trigger</w:t>
-            </w:r>
-          </w:p>
-        </w:tc>
-      </w:tr>
-      <w:tr>
-        <w:tc>
-          <w:tcPr>
-            <w:tcW w:type="dxa" w:w="500"/>
-            <w:tcBorders>
-              <w:top w:val="single" w:color="CCCCCC" w:sz="1"/>
-              <w:left w:val="single" w:color="CCCCCC" w:sz="1"/>
-              <w:bottom w:val="single" w:color="CCCCCC" w:sz="1"/>
-              <w:right w:val="single" w:color="CCCCCC" w:sz="1"/>
-            </w:tcBorders>
-            <w:tcMar>
-              <w:top w:type="dxa" w:w="60"/>
-              <w:left w:type="dxa" w:w="100"/>
-              <w:bottom w:type="dxa" w:w="60"/>
-              <w:right w:type="dxa" w:w="100"/>
-            </w:tcMar>
-          </w:tcPr>
-          <w:p>
-            <w:pPr>
-              <w:jc w:val="center"/>
-            </w:pPr>
-            <w:r>
-              <w:rPr>
-                <w:rFonts w:ascii="Helvetica" w:cs="Helvetica" w:eastAsia="Helvetica" w:hAnsi="Helvetica"/>
-                <w:b/>
-                <w:bCs/>
-                <w:color w:val="000000"/>
-                <w:sz w:val="16"/>
-                <w:szCs w:val="16"/>
-              </w:rPr>
-              <w:t xml:space="preserve">2</w:t>
-            </w:r>
-          </w:p>
-        </w:tc>
-        <w:tc>
-          <w:tcPr>
-            <w:tcW w:type="dxa" w:w="3200"/>
-            <w:tcBorders>
-              <w:top w:val="single" w:color="CCCCCC" w:sz="1"/>
-              <w:left w:val="single" w:color="CCCCCC" w:sz="1"/>
-              <w:bottom w:val="single" w:color="CCCCCC" w:sz="1"/>
-              <w:right w:val="single" w:color="CCCCCC" w:sz="1"/>
-            </w:tcBorders>
-            <w:tcMar>
-              <w:top w:type="dxa" w:w="60"/>
-              <w:left w:type="dxa" w:w="100"/>
-              <w:bottom w:type="dxa" w:w="60"/>
-              <w:right w:type="dxa" w:w="100"/>
-            </w:tcMar>
-          </w:tcPr>
-          <w:p>
-            <w:pPr>
-              <w:jc w:val="left"/>
-            </w:pPr>
-            <w:r>
-              <w:rPr>
-                <w:rFonts w:ascii="Helvetica" w:cs="Helvetica" w:eastAsia="Helvetica" w:hAnsi="Helvetica"/>
-                <w:b w:val="false"/>
-                <w:bCs w:val="false"/>
-                <w:color w:val="000000"/>
-                <w:sz w:val="16"/>
-                <w:szCs w:val="16"/>
-              </w:rPr>
-              <w:t xml:space="preserve">55.5% of members respond “Hello?” to pitch</w:t>
-            </w:r>
-          </w:p>
-        </w:tc>
-        <w:tc>
-          <w:tcPr>
-            <w:tcW w:type="dxa" w:w="2260"/>
-            <w:tcBorders>
-              <w:top w:val="single" w:color="CCCCCC" w:sz="1"/>
-              <w:left w:val="single" w:color="CCCCCC" w:sz="1"/>
-              <w:bottom w:val="single" w:color="CCCCCC" w:sz="1"/>
-              <w:right w:val="single" w:color="CCCCCC" w:sz="1"/>
-            </w:tcBorders>
-            <w:tcMar>
-              <w:top w:type="dxa" w:w="60"/>
-              <w:left w:type="dxa" w:w="100"/>
-              <w:bottom w:type="dxa" w:w="60"/>
-              <w:right w:type="dxa" w:w="100"/>
-            </w:tcMar>
-          </w:tcPr>
-          <w:p>
-            <w:pPr>
-              <w:jc w:val="center"/>
-            </w:pPr>
-            <w:r>
-              <w:rPr>
-                <w:rFonts w:ascii="Helvetica" w:cs="Helvetica" w:eastAsia="Helvetica" w:hAnsi="Helvetica"/>
-                <w:b/>
-                <w:bCs/>
-                <w:color w:val="000000"/>
-                <w:sz w:val="16"/>
-                <w:szCs w:val="16"/>
-              </w:rPr>
-              <w:t xml:space="preserve">96/173</w:t>
-            </w:r>
-          </w:p>
-        </w:tc>
-        <w:tc>
-          <w:tcPr>
-            <w:tcW w:type="dxa" w:w="3400"/>
-            <w:tcBorders>
-              <w:top w:val="single" w:color="CCCCCC" w:sz="1"/>
-              <w:left w:val="single" w:color="CCCCCC" w:sz="1"/>
-              <w:bottom w:val="single" w:color="CCCCCC" w:sz="1"/>
-              <w:right w:val="single" w:color="CCCCCC" w:sz="1"/>
-            </w:tcBorders>
-            <w:tcMar>
-              <w:top w:type="dxa" w:w="60"/>
-              <w:left w:type="dxa" w:w="100"/>
-              <w:bottom w:type="dxa" w:w="60"/>
-              <w:right w:type="dxa" w:w="100"/>
-            </w:tcMar>
-          </w:tcPr>
-          <w:p>
-            <w:pPr>
-              <w:jc w:val="left"/>
-            </w:pPr>
-            <w:r>
-              <w:rPr>
-                <w:rFonts w:ascii="Helvetica" w:cs="Helvetica" w:eastAsia="Helvetica" w:hAnsi="Helvetica"/>
-                <w:b w:val="false"/>
-                <w:bCs w:val="false"/>
-                <w:color w:val="666666"/>
-                <w:sz w:val="16"/>
-                <w:szCs w:val="16"/>
-              </w:rPr>
-              <w:t xml:space="preserve">Pitch fires before member is ready</w:t>
-            </w:r>
-          </w:p>
-        </w:tc>
-      </w:tr>
-      <w:tr>
-        <w:tc>
-          <w:tcPr>
-            <w:tcW w:type="dxa" w:w="500"/>
-            <w:tcBorders>
-              <w:top w:val="single" w:color="CCCCCC" w:sz="1"/>
-              <w:left w:val="single" w:color="CCCCCC" w:sz="1"/>
-              <w:bottom w:val="single" w:color="CCCCCC" w:sz="1"/>
-              <w:right w:val="single" w:color="CCCCCC" w:sz="1"/>
-            </w:tcBorders>
-            <w:tcMar>
-              <w:top w:type="dxa" w:w="60"/>
-              <w:left w:type="dxa" w:w="100"/>
-              <w:bottom w:type="dxa" w:w="60"/>
-              <w:right w:type="dxa" w:w="100"/>
-            </w:tcMar>
-          </w:tcPr>
-          <w:p>
-            <w:pPr>
-              <w:jc w:val="center"/>
-            </w:pPr>
-            <w:r>
-              <w:rPr>
-                <w:rFonts w:ascii="Helvetica" w:cs="Helvetica" w:eastAsia="Helvetica" w:hAnsi="Helvetica"/>
-                <w:b/>
-                <w:bCs/>
-                <w:color w:val="000000"/>
-                <w:sz w:val="16"/>
-                <w:szCs w:val="16"/>
-              </w:rPr>
-              <w:t xml:space="preserve">3</w:t>
-            </w:r>
-          </w:p>
-        </w:tc>
-        <w:tc>
-          <w:tcPr>
-            <w:tcW w:type="dxa" w:w="3200"/>
-            <w:tcBorders>
-              <w:top w:val="single" w:color="CCCCCC" w:sz="1"/>
-              <w:left w:val="single" w:color="CCCCCC" w:sz="1"/>
-              <w:bottom w:val="single" w:color="CCCCCC" w:sz="1"/>
-              <w:right w:val="single" w:color="CCCCCC" w:sz="1"/>
-            </w:tcBorders>
-            <w:tcMar>
-              <w:top w:type="dxa" w:w="60"/>
-              <w:left w:type="dxa" w:w="100"/>
-              <w:bottom w:type="dxa" w:w="60"/>
-              <w:right w:type="dxa" w:w="100"/>
-            </w:tcMar>
-          </w:tcPr>
-          <w:p>
-            <w:pPr>
-              <w:jc w:val="left"/>
-            </w:pPr>
-            <w:r>
-              <w:rPr>
-                <w:rFonts w:ascii="Helvetica" w:cs="Helvetica" w:eastAsia="Helvetica" w:hAnsi="Helvetica"/>
-                <w:b w:val="false"/>
-                <w:bCs w:val="false"/>
-                <w:color w:val="000000"/>
-                <w:sz w:val="16"/>
-                <w:szCs w:val="16"/>
-              </w:rPr>
-              <w:t xml:space="preserve">After “Hello?”, agent plays disclaimer 67.7%</w:t>
-            </w:r>
-          </w:p>
-        </w:tc>
-        <w:tc>
-          <w:tcPr>
-            <w:tcW w:type="dxa" w:w="2260"/>
-            <w:tcBorders>
-              <w:top w:val="single" w:color="CCCCCC" w:sz="1"/>
-              <w:left w:val="single" w:color="CCCCCC" w:sz="1"/>
-              <w:bottom w:val="single" w:color="CCCCCC" w:sz="1"/>
-              <w:right w:val="single" w:color="CCCCCC" w:sz="1"/>
-            </w:tcBorders>
-            <w:tcMar>
-              <w:top w:type="dxa" w:w="60"/>
-              <w:left w:type="dxa" w:w="100"/>
-              <w:bottom w:type="dxa" w:w="60"/>
-              <w:right w:type="dxa" w:w="100"/>
-            </w:tcMar>
-          </w:tcPr>
-          <w:p>
-            <w:pPr>
-              <w:jc w:val="center"/>
-            </w:pPr>
-            <w:r>
-              <w:rPr>
-                <w:rFonts w:ascii="Helvetica" w:cs="Helvetica" w:eastAsia="Helvetica" w:hAnsi="Helvetica"/>
-                <w:b/>
-                <w:bCs/>
-                <w:color w:val="000000"/>
-                <w:sz w:val="16"/>
-                <w:szCs w:val="16"/>
-              </w:rPr>
-              <w:t xml:space="preserve">84/124</w:t>
-            </w:r>
-          </w:p>
-        </w:tc>
-        <w:tc>
-          <w:tcPr>
-            <w:tcW w:type="dxa" w:w="3400"/>
-            <w:tcBorders>
-              <w:top w:val="single" w:color="CCCCCC" w:sz="1"/>
-              <w:left w:val="single" w:color="CCCCCC" w:sz="1"/>
-              <w:bottom w:val="single" w:color="CCCCCC" w:sz="1"/>
-              <w:right w:val="single" w:color="CCCCCC" w:sz="1"/>
-            </w:tcBorders>
-            <w:tcMar>
-              <w:top w:type="dxa" w:w="60"/>
-              <w:left w:type="dxa" w:w="100"/>
-              <w:bottom w:type="dxa" w:w="60"/>
-              <w:right w:type="dxa" w:w="100"/>
-            </w:tcMar>
-          </w:tcPr>
-          <w:p>
-            <w:pPr>
-              <w:jc w:val="left"/>
-            </w:pPr>
-            <w:r>
-              <w:rPr>
-                <w:rFonts w:ascii="Helvetica" w:cs="Helvetica" w:eastAsia="Helvetica" w:hAnsi="Helvetica"/>
-                <w:b w:val="false"/>
-                <w:bCs w:val="false"/>
-                <w:color w:val="666666"/>
-                <w:sz w:val="16"/>
-                <w:szCs w:val="16"/>
-              </w:rPr>
-              <w:t xml:space="preserve">Should greet first, then disclaimer</w:t>
-            </w:r>
-          </w:p>
-        </w:tc>
-      </w:tr>
-      <w:tr>
-        <w:tc>
-          <w:tcPr>
-            <w:tcW w:type="dxa" w:w="500"/>
-            <w:tcBorders>
-              <w:top w:val="single" w:color="CCCCCC" w:sz="1"/>
-              <w:left w:val="single" w:color="CCCCCC" w:sz="1"/>
-              <w:bottom w:val="single" w:color="CCCCCC" w:sz="1"/>
-              <w:right w:val="single" w:color="CCCCCC" w:sz="1"/>
-            </w:tcBorders>
-            <w:tcMar>
-              <w:top w:type="dxa" w:w="60"/>
-              <w:left w:type="dxa" w:w="100"/>
-              <w:bottom w:type="dxa" w:w="60"/>
-              <w:right w:type="dxa" w:w="100"/>
-            </w:tcMar>
-          </w:tcPr>
-          <w:p>
-            <w:pPr>
-              <w:jc w:val="center"/>
-            </w:pPr>
-            <w:r>
-              <w:rPr>
-                <w:rFonts w:ascii="Helvetica" w:cs="Helvetica" w:eastAsia="Helvetica" w:hAnsi="Helvetica"/>
-                <w:b/>
-                <w:bCs/>
-                <w:color w:val="000000"/>
-                <w:sz w:val="16"/>
-                <w:szCs w:val="16"/>
-              </w:rPr>
-              <w:t xml:space="preserve">4</w:t>
-            </w:r>
-          </w:p>
-        </w:tc>
-        <w:tc>
-          <w:tcPr>
-            <w:tcW w:type="dxa" w:w="3200"/>
-            <w:tcBorders>
-              <w:top w:val="single" w:color="CCCCCC" w:sz="1"/>
-              <w:left w:val="single" w:color="CCCCCC" w:sz="1"/>
-              <w:bottom w:val="single" w:color="CCCCCC" w:sz="1"/>
-              <w:right w:val="single" w:color="CCCCCC" w:sz="1"/>
-            </w:tcBorders>
-            <w:tcMar>
-              <w:top w:type="dxa" w:w="60"/>
-              <w:left w:type="dxa" w:w="100"/>
-              <w:bottom w:type="dxa" w:w="60"/>
-              <w:right w:type="dxa" w:w="100"/>
-            </w:tcMar>
-          </w:tcPr>
-          <w:p>
-            <w:pPr>
-              <w:jc w:val="left"/>
-            </w:pPr>
-            <w:r>
-              <w:rPr>
-                <w:rFonts w:ascii="Helvetica" w:cs="Helvetica" w:eastAsia="Helvetica" w:hAnsi="Helvetica"/>
-                <w:b w:val="false"/>
-                <w:bCs w:val="false"/>
-                <w:color w:val="000000"/>
-                <w:sz w:val="16"/>
-                <w:szCs w:val="16"/>
-              </w:rPr>
-              <w:t xml:space="preserve">Call screening correlates with success</w:t>
-            </w:r>
-          </w:p>
-        </w:tc>
-        <w:tc>
-          <w:tcPr>
-            <w:tcW w:type="dxa" w:w="2260"/>
-            <w:tcBorders>
-              <w:top w:val="single" w:color="CCCCCC" w:sz="1"/>
-              <w:left w:val="single" w:color="CCCCCC" w:sz="1"/>
-              <w:bottom w:val="single" w:color="CCCCCC" w:sz="1"/>
-              <w:right w:val="single" w:color="CCCCCC" w:sz="1"/>
-            </w:tcBorders>
-            <w:tcMar>
-              <w:top w:type="dxa" w:w="60"/>
-              <w:left w:type="dxa" w:w="100"/>
-              <w:bottom w:type="dxa" w:w="60"/>
-              <w:right w:type="dxa" w:w="100"/>
-            </w:tcMar>
-          </w:tcPr>
-          <w:p>
-            <w:pPr>
-              <w:jc w:val="center"/>
-            </w:pPr>
-            <w:r>
-              <w:rPr>
-                <w:rFonts w:ascii="Helvetica" w:cs="Helvetica" w:eastAsia="Helvetica" w:hAnsi="Helvetica"/>
-                <w:b/>
-                <w:bCs/>
-                <w:color w:val="000000"/>
-                <w:sz w:val="16"/>
-                <w:szCs w:val="16"/>
-              </w:rPr>
-              <w:t xml:space="preserve">48.7% vs 7.0%</w:t>
-            </w:r>
-          </w:p>
-        </w:tc>
-        <w:tc>
-          <w:tcPr>
-            <w:tcW w:type="dxa" w:w="3400"/>
-            <w:tcBorders>
-              <w:top w:val="single" w:color="CCCCCC" w:sz="1"/>
-              <w:left w:val="single" w:color="CCCCCC" w:sz="1"/>
-              <w:bottom w:val="single" w:color="CCCCCC" w:sz="1"/>
-              <w:right w:val="single" w:color="CCCCCC" w:sz="1"/>
-            </w:tcBorders>
-            <w:tcMar>
-              <w:top w:type="dxa" w:w="60"/>
-              <w:left w:type="dxa" w:w="100"/>
-              <w:bottom w:type="dxa" w:w="60"/>
-              <w:right w:type="dxa" w:w="100"/>
-            </w:tcMar>
-          </w:tcPr>
-          <w:p>
-            <w:pPr>
-              <w:jc w:val="left"/>
-            </w:pPr>
-            <w:r>
-              <w:rPr>
-                <w:rFonts w:ascii="Helvetica" w:cs="Helvetica" w:eastAsia="Helvetica" w:hAnsi="Helvetica"/>
-                <w:b w:val="false"/>
-                <w:bCs w:val="false"/>
-                <w:color w:val="666666"/>
-                <w:sz w:val="16"/>
-                <w:szCs w:val="16"/>
-              </w:rPr>
-              <w:t xml:space="preserve">Screening accidentally fixes the flow</w:t>
-            </w:r>
-          </w:p>
-        </w:tc>
-      </w:tr>
-      <w:tr>
-        <w:tc>
-          <w:tcPr>
-            <w:tcW w:type="dxa" w:w="500"/>
-            <w:tcBorders>
-              <w:top w:val="single" w:color="CCCCCC" w:sz="1"/>
-              <w:left w:val="single" w:color="CCCCCC" w:sz="1"/>
-              <w:bottom w:val="single" w:color="CCCCCC" w:sz="1"/>
-              <w:right w:val="single" w:color="CCCCCC" w:sz="1"/>
-            </w:tcBorders>
-            <w:tcMar>
-              <w:top w:type="dxa" w:w="60"/>
-              <w:left w:type="dxa" w:w="100"/>
-              <w:bottom w:type="dxa" w:w="60"/>
-              <w:right w:type="dxa" w:w="100"/>
-            </w:tcMar>
-          </w:tcPr>
-          <w:p>
-            <w:pPr>
-              <w:jc w:val="center"/>
-            </w:pPr>
-            <w:r>
-              <w:rPr>
-                <w:rFonts w:ascii="Helvetica" w:cs="Helvetica" w:eastAsia="Helvetica" w:hAnsi="Helvetica"/>
-                <w:b/>
-                <w:bCs/>
-                <w:color w:val="000000"/>
-                <w:sz w:val="16"/>
-                <w:szCs w:val="16"/>
-              </w:rPr>
-              <w:t xml:space="preserve">5</w:t>
-            </w:r>
-          </w:p>
-        </w:tc>
-        <w:tc>
-          <w:tcPr>
-            <w:tcW w:type="dxa" w:w="3200"/>
-            <w:tcBorders>
-              <w:top w:val="single" w:color="CCCCCC" w:sz="1"/>
-              <w:left w:val="single" w:color="CCCCCC" w:sz="1"/>
-              <w:bottom w:val="single" w:color="CCCCCC" w:sz="1"/>
-              <w:right w:val="single" w:color="CCCCCC" w:sz="1"/>
-            </w:tcBorders>
-            <w:tcMar>
-              <w:top w:type="dxa" w:w="60"/>
-              <w:left w:type="dxa" w:w="100"/>
-              <w:bottom w:type="dxa" w:w="60"/>
-              <w:right w:type="dxa" w:w="100"/>
-            </w:tcMar>
-          </w:tcPr>
-          <w:p>
-            <w:pPr>
-              <w:jc w:val="left"/>
-            </w:pPr>
-            <w:r>
-              <w:rPr>
-                <w:rFonts w:ascii="Helvetica" w:cs="Helvetica" w:eastAsia="Helvetica" w:hAnsi="Helvetica"/>
-                <w:b w:val="false"/>
-                <w:bCs w:val="false"/>
-                <w:color w:val="000000"/>
-                <w:sz w:val="16"/>
-                <w:szCs w:val="16"/>
-              </w:rPr>
-              <w:t xml:space="preserve">Zero members asked follow-up questions</w:t>
-            </w:r>
-          </w:p>
-        </w:tc>
-        <w:tc>
-          <w:tcPr>
-            <w:tcW w:type="dxa" w:w="2260"/>
-            <w:tcBorders>
-              <w:top w:val="single" w:color="CCCCCC" w:sz="1"/>
-              <w:left w:val="single" w:color="CCCCCC" w:sz="1"/>
-              <w:bottom w:val="single" w:color="CCCCCC" w:sz="1"/>
-              <w:right w:val="single" w:color="CCCCCC" w:sz="1"/>
-            </w:tcBorders>
-            <w:tcMar>
-              <w:top w:type="dxa" w:w="60"/>
-              <w:left w:type="dxa" w:w="100"/>
-              <w:bottom w:type="dxa" w:w="60"/>
-              <w:right w:type="dxa" w:w="100"/>
-            </w:tcMar>
-          </w:tcPr>
-          <w:p>
-            <w:pPr>
-              <w:jc w:val="center"/>
-            </w:pPr>
-            <w:r>
-              <w:rPr>
-                <w:rFonts w:ascii="Helvetica" w:cs="Helvetica" w:eastAsia="Helvetica" w:hAnsi="Helvetica"/>
-                <w:b/>
-                <w:bCs/>
-                <w:color w:val="000000"/>
-                <w:sz w:val="16"/>
-                <w:szCs w:val="16"/>
-              </w:rPr>
-              <w:t xml:space="preserve">0/240</w:t>
-            </w:r>
-          </w:p>
-        </w:tc>
-        <w:tc>
-          <w:tcPr>
-            <w:tcW w:type="dxa" w:w="3400"/>
-            <w:tcBorders>
-              <w:top w:val="single" w:color="CCCCCC" w:sz="1"/>
-              <w:left w:val="single" w:color="CCCCCC" w:sz="1"/>
-              <w:bottom w:val="single" w:color="CCCCCC" w:sz="1"/>
-              <w:right w:val="single" w:color="CCCCCC" w:sz="1"/>
-            </w:tcBorders>
-            <w:tcMar>
-              <w:top w:type="dxa" w:w="60"/>
-              <w:left w:type="dxa" w:w="100"/>
-              <w:bottom w:type="dxa" w:w="60"/>
-              <w:right w:type="dxa" w:w="100"/>
-            </w:tcMar>
-          </w:tcPr>
-          <w:p>
-            <w:pPr>
-              <w:jc w:val="left"/>
-            </w:pPr>
-            <w:r>
-              <w:rPr>
-                <w:rFonts w:ascii="Helvetica" w:cs="Helvetica" w:eastAsia="Helvetica" w:hAnsi="Helvetica"/>
-                <w:b w:val="false"/>
-                <w:bCs w:val="false"/>
-                <w:color w:val="666666"/>
-                <w:sz w:val="16"/>
-                <w:szCs w:val="16"/>
-              </w:rPr>
-              <w:t xml:space="preserve">Agent talks; members don’t engage</w:t>
-            </w:r>
-          </w:p>
-        </w:tc>
-      </w:tr>
-      <w:tr>
-        <w:tc>
-          <w:tcPr>
-            <w:tcW w:type="dxa" w:w="500"/>
-            <w:tcBorders>
-              <w:top w:val="single" w:color="CCCCCC" w:sz="1"/>
-              <w:left w:val="single" w:color="CCCCCC" w:sz="1"/>
-              <w:bottom w:val="single" w:color="CCCCCC" w:sz="1"/>
-              <w:right w:val="single" w:color="CCCCCC" w:sz="1"/>
-            </w:tcBorders>
-            <w:tcMar>
-              <w:top w:type="dxa" w:w="60"/>
-              <w:left w:type="dxa" w:w="100"/>
-              <w:bottom w:type="dxa" w:w="60"/>
-              <w:right w:type="dxa" w:w="100"/>
-            </w:tcMar>
-          </w:tcPr>
-          <w:p>
-            <w:pPr>
-              <w:jc w:val="center"/>
-            </w:pPr>
-            <w:r>
-              <w:rPr>
-                <w:rFonts w:ascii="Helvetica" w:cs="Helvetica" w:eastAsia="Helvetica" w:hAnsi="Helvetica"/>
-                <w:b/>
-                <w:bCs/>
-                <w:color w:val="000000"/>
-                <w:sz w:val="16"/>
-                <w:szCs w:val="16"/>
-              </w:rPr>
-              <w:t xml:space="preserve">6</w:t>
-            </w:r>
-          </w:p>
-        </w:tc>
-        <w:tc>
-          <w:tcPr>
-            <w:tcW w:type="dxa" w:w="3200"/>
-            <w:tcBorders>
-              <w:top w:val="single" w:color="CCCCCC" w:sz="1"/>
-              <w:left w:val="single" w:color="CCCCCC" w:sz="1"/>
-              <w:bottom w:val="single" w:color="CCCCCC" w:sz="1"/>
-              <w:right w:val="single" w:color="CCCCCC" w:sz="1"/>
-            </w:tcBorders>
-            <w:tcMar>
-              <w:top w:type="dxa" w:w="60"/>
-              <w:left w:type="dxa" w:w="100"/>
-              <w:bottom w:type="dxa" w:w="60"/>
-              <w:right w:type="dxa" w:w="100"/>
-            </w:tcMar>
-          </w:tcPr>
-          <w:p>
-            <w:pPr>
-              <w:jc w:val="left"/>
-            </w:pPr>
-            <w:r>
-              <w:rPr>
-                <w:rFonts w:ascii="Helvetica" w:cs="Helvetica" w:eastAsia="Helvetica" w:hAnsi="Helvetica"/>
-                <w:b w:val="false"/>
-                <w:bCs w:val="false"/>
-                <w:color w:val="000000"/>
-                <w:sz w:val="16"/>
-                <w:szCs w:val="16"/>
-              </w:rPr>
-              <w:t xml:space="preserve">Double-pitch bug in 68.3% of spoke_to</w:t>
-            </w:r>
-          </w:p>
-        </w:tc>
-        <w:tc>
-          <w:tcPr>
-            <w:tcW w:type="dxa" w:w="2260"/>
-            <w:tcBorders>
-              <w:top w:val="single" w:color="CCCCCC" w:sz="1"/>
-              <w:left w:val="single" w:color="CCCCCC" w:sz="1"/>
-              <w:bottom w:val="single" w:color="CCCCCC" w:sz="1"/>
-              <w:right w:val="single" w:color="CCCCCC" w:sz="1"/>
-            </w:tcBorders>
-            <w:tcMar>
-              <w:top w:type="dxa" w:w="60"/>
-              <w:left w:type="dxa" w:w="100"/>
-              <w:bottom w:type="dxa" w:w="60"/>
-              <w:right w:type="dxa" w:w="100"/>
-            </w:tcMar>
-          </w:tcPr>
-          <w:p>
-            <w:pPr>
-              <w:jc w:val="center"/>
-            </w:pPr>
-            <w:r>
-              <w:rPr>
-                <w:rFonts w:ascii="Helvetica" w:cs="Helvetica" w:eastAsia="Helvetica" w:hAnsi="Helvetica"/>
-                <w:b/>
-                <w:bCs/>
-                <w:color w:val="000000"/>
-                <w:sz w:val="16"/>
-                <w:szCs w:val="16"/>
-              </w:rPr>
-              <w:t xml:space="preserve">164/240</w:t>
-            </w:r>
-          </w:p>
-        </w:tc>
-        <w:tc>
-          <w:tcPr>
-            <w:tcW w:type="dxa" w:w="3400"/>
-            <w:tcBorders>
-              <w:top w:val="single" w:color="CCCCCC" w:sz="1"/>
-              <w:left w:val="single" w:color="CCCCCC" w:sz="1"/>
-              <w:bottom w:val="single" w:color="CCCCCC" w:sz="1"/>
-              <w:right w:val="single" w:color="CCCCCC" w:sz="1"/>
-            </w:tcBorders>
-            <w:tcMar>
-              <w:top w:type="dxa" w:w="60"/>
-              <w:left w:type="dxa" w:w="100"/>
-              <w:bottom w:type="dxa" w:w="60"/>
-              <w:right w:type="dxa" w:w="100"/>
-            </w:tcMar>
-          </w:tcPr>
-          <w:p>
-            <w:pPr>
-              <w:jc w:val="left"/>
-            </w:pPr>
-            <w:r>
-              <w:rPr>
-                <w:rFonts w:ascii="Helvetica" w:cs="Helvetica" w:eastAsia="Helvetica" w:hAnsi="Helvetica"/>
-                <w:b w:val="false"/>
-                <w:bCs w:val="false"/>
-                <w:color w:val="666666"/>
-                <w:sz w:val="16"/>
-                <w:szCs w:val="16"/>
-              </w:rPr>
-              <w:t xml:space="preserve">Top engineering fix</w:t>
-            </w:r>
-          </w:p>
-        </w:tc>
-      </w:tr>
-    </w:tbl>
-    <w:p>
-      <w:pPr>
-        <w:spacing w:after="80" w:before="80"/>
-      </w:pPr>
-    </w:p>
-    <w:p>
-      <w:pPr>
-        <w:pStyle w:val="Heading3"/>
-      </w:pPr>
-      <w:r>
-        <w:rPr>
-          <w:rFonts w:ascii="Helvetica" w:cs="Helvetica" w:eastAsia="Helvetica" w:hAnsi="Helvetica"/>
-          <w:b/>
-          <w:bCs/>
-          <w:color w:val="1A1A2E"/>
-        </w:rPr>
-        <w:t xml:space="preserve">Why Call Screening Helps</w:t>
-      </w:r>
-    </w:p>
-    <w:p>
-      <w:pPr>
-        <w:spacing w:after="100"/>
-      </w:pPr>
-      <w:r>
-        <w:rPr>
-          <w:rFonts w:ascii="Helvetica" w:cs="Helvetica" w:eastAsia="Helvetica" w:hAnsi="Helvetica"/>
-          <w:b w:val="false"/>
-          <w:bCs w:val="false"/>
-          <w:color w:val="000000"/>
-          <w:sz w:val="18"/>
-          <w:szCs w:val="18"/>
-        </w:rPr>
-        <w:t xml:space="preserve">48.7% of successful conversations went through call screening (the “If you record your name...” prompt). Only 7.0% of failures did. Call screening forces the agent through the fallback path, which accidentally produces the correct sequence: re-greeting → disclaimer → pitch. The failure path skips this and opens with pitch → disclaimer → repeated pitch.</w:t>
-      </w:r>
-    </w:p>
-    <w:p>
-      <w:pPr>
-        <w:spacing w:after="80" w:before="80"/>
-      </w:pPr>
-    </w:p>
-    <w:p>
-      <w:pPr>
-        <w:pStyle w:val="Heading3"/>
-      </w:pPr>
-      <w:r>
-        <w:rPr>
-          <w:rFonts w:ascii="Helvetica" w:cs="Helvetica" w:eastAsia="Helvetica" w:hAnsi="Helvetica"/>
-          <w:b/>
-          <w:bCs/>
-          <w:color w:val="1A1A2E"/>
-        </w:rPr>
-        <w:t xml:space="preserve">Failure Taxonomy (&lt;30s calls)</w:t>
-      </w:r>
-    </w:p>
-    <w:tbl>
-      <w:tblPr>
-        <w:tblW w:type="dxa" w:w="9360"/>
-        <w:tblBorders>
-          <w:top w:val="single" w:color="auto" w:sz="4"/>
-          <w:left w:val="single" w:color="auto" w:sz="4"/>
-          <w:bottom w:val="single" w:color="auto" w:sz="4"/>
-          <w:right w:val="single" w:color="auto" w:sz="4"/>
-          <w:insideH w:val="single" w:color="auto" w:sz="4"/>
-          <w:insideV w:val="single" w:color="auto" w:sz="4"/>
-        </w:tblBorders>
-      </w:tblPr>
-      <w:tblGrid>
-        <w:gridCol w:w="3500"/>
-        <w:gridCol w:w="1200"/>
-        <w:gridCol w:w="1660"/>
-        <w:gridCol w:w="3000"/>
-      </w:tblGrid>
-      <w:tr>
-        <w:tc>
-          <w:tcPr>
-            <w:tcW w:type="dxa" w:w="3500"/>
-            <w:tcBorders>
-              <w:top w:val="single" w:color="CCCCCC" w:sz="1"/>
-              <w:left w:val="single" w:color="CCCCCC" w:sz="1"/>
-              <w:bottom w:val="single" w:color="CCCCCC" w:sz="1"/>
-              <w:right w:val="single" w:color="CCCCCC" w:sz="1"/>
-            </w:tcBorders>
-            <w:shd w:fill="1A1A2E" w:val="clear"/>
-            <w:tcMar>
-              <w:top w:type="dxa" w:w="60"/>
-              <w:left w:type="dxa" w:w="100"/>
-              <w:bottom w:type="dxa" w:w="60"/>
-              <w:right w:type="dxa" w:w="100"/>
-            </w:tcMar>
-            <w:vAlign w:val="center"/>
-          </w:tcPr>
-          <w:p>
-            <w:pPr>
-              <w:jc w:val="center"/>
-            </w:pPr>
-            <w:r>
-              <w:rPr>
-                <w:rFonts w:ascii="Helvetica" w:cs="Helvetica" w:eastAsia="Helvetica" w:hAnsi="Helvetica"/>
-                <w:b/>
-                <w:bCs/>
-                <w:color w:val="FFFFFF"/>
-                <w:sz w:val="16"/>
-                <w:szCs w:val="16"/>
-              </w:rPr>
-              <w:t xml:space="preserve">Failure Mode</w:t>
-            </w:r>
-          </w:p>
-        </w:tc>
-        <w:tc>
-          <w:tcPr>
-            <w:tcW w:type="dxa" w:w="1200"/>
-            <w:tcBorders>
-              <w:top w:val="single" w:color="CCCCCC" w:sz="1"/>
-              <w:left w:val="single" w:color="CCCCCC" w:sz="1"/>
-              <w:bottom w:val="single" w:color="CCCCCC" w:sz="1"/>
-              <w:right w:val="single" w:color="CCCCCC" w:sz="1"/>
-            </w:tcBorders>
-            <w:shd w:fill="1A1A2E" w:val="clear"/>
-            <w:tcMar>
-              <w:top w:type="dxa" w:w="60"/>
-              <w:left w:type="dxa" w:w="100"/>
-              <w:bottom w:type="dxa" w:w="60"/>
-              <w:right w:type="dxa" w:w="100"/>
-            </w:tcMar>
-            <w:vAlign w:val="center"/>
-          </w:tcPr>
-          <w:p>
-            <w:pPr>
-              <w:jc w:val="center"/>
-            </w:pPr>
-            <w:r>
-              <w:rPr>
-                <w:rFonts w:ascii="Helvetica" w:cs="Helvetica" w:eastAsia="Helvetica" w:hAnsi="Helvetica"/>
-                <w:b/>
-                <w:bCs/>
-                <w:color w:val="FFFFFF"/>
-                <w:sz w:val="16"/>
-                <w:szCs w:val="16"/>
-              </w:rPr>
-              <w:t xml:space="preserve">Count</w:t>
-            </w:r>
-          </w:p>
-        </w:tc>
-        <w:tc>
-          <w:tcPr>
-            <w:tcW w:type="dxa" w:w="1660"/>
-            <w:tcBorders>
-              <w:top w:val="single" w:color="CCCCCC" w:sz="1"/>
-              <w:left w:val="single" w:color="CCCCCC" w:sz="1"/>
-              <w:bottom w:val="single" w:color="CCCCCC" w:sz="1"/>
-              <w:right w:val="single" w:color="CCCCCC" w:sz="1"/>
-            </w:tcBorders>
-            <w:shd w:fill="1A1A2E" w:val="clear"/>
-            <w:tcMar>
-              <w:top w:type="dxa" w:w="60"/>
-              <w:left w:type="dxa" w:w="100"/>
-              <w:bottom w:type="dxa" w:w="60"/>
-              <w:right w:type="dxa" w:w="100"/>
-            </w:tcMar>
-            <w:vAlign w:val="center"/>
-          </w:tcPr>
-          <w:p>
-            <w:pPr>
-              <w:jc w:val="center"/>
-            </w:pPr>
-            <w:r>
-              <w:rPr>
-                <w:rFonts w:ascii="Helvetica" w:cs="Helvetica" w:eastAsia="Helvetica" w:hAnsi="Helvetica"/>
-                <w:b/>
-                <w:bCs/>
-                <w:color w:val="FFFFFF"/>
-                <w:sz w:val="16"/>
-                <w:szCs w:val="16"/>
-              </w:rPr>
-              <w:t xml:space="preserve">% of 184</w:t>
-            </w:r>
-          </w:p>
-        </w:tc>
-        <w:tc>
-          <w:tcPr>
-            <w:tcW w:type="dxa" w:w="3000"/>
-            <w:tcBorders>
-              <w:top w:val="single" w:color="CCCCCC" w:sz="1"/>
-              <w:left w:val="single" w:color="CCCCCC" w:sz="1"/>
-              <w:bottom w:val="single" w:color="CCCCCC" w:sz="1"/>
-              <w:right w:val="single" w:color="CCCCCC" w:sz="1"/>
-            </w:tcBorders>
-            <w:shd w:fill="1A1A2E" w:val="clear"/>
-            <w:tcMar>
-              <w:top w:type="dxa" w:w="60"/>
-              <w:left w:type="dxa" w:w="100"/>
-              <w:bottom w:type="dxa" w:w="60"/>
-              <w:right w:type="dxa" w:w="100"/>
-            </w:tcMar>
-            <w:vAlign w:val="center"/>
-          </w:tcPr>
-          <w:p>
-            <w:pPr>
-              <w:jc w:val="center"/>
-            </w:pPr>
-            <w:r>
-              <w:rPr>
-                <w:rFonts w:ascii="Helvetica" w:cs="Helvetica" w:eastAsia="Helvetica" w:hAnsi="Helvetica"/>
-                <w:b/>
-                <w:bCs/>
-                <w:color w:val="FFFFFF"/>
-                <w:sz w:val="16"/>
-                <w:szCs w:val="16"/>
-              </w:rPr>
-              <w:t xml:space="preserve">Fix Category</w:t>
-            </w:r>
-          </w:p>
-        </w:tc>
-      </w:tr>
-      <w:tr>
-        <w:tc>
-          <w:tcPr>
-            <w:tcW w:type="dxa" w:w="3500"/>
-            <w:tcBorders>
-              <w:top w:val="single" w:color="CCCCCC" w:sz="1"/>
-              <w:left w:val="single" w:color="CCCCCC" w:sz="1"/>
-              <w:bottom w:val="single" w:color="CCCCCC" w:sz="1"/>
-              <w:right w:val="single" w:color="CCCCCC" w:sz="1"/>
-            </w:tcBorders>
-            <w:tcMar>
-              <w:top w:type="dxa" w:w="60"/>
-              <w:left w:type="dxa" w:w="100"/>
-              <w:bottom w:type="dxa" w:w="60"/>
-              <w:right w:type="dxa" w:w="100"/>
-            </w:tcMar>
-          </w:tcPr>
-          <w:p>
-            <w:pPr>
-              <w:jc w:val="left"/>
-            </w:pPr>
-            <w:r>
-              <w:rPr>
-                <w:rFonts w:ascii="Helvetica" w:cs="Helvetica" w:eastAsia="Helvetica" w:hAnsi="Helvetica"/>
-                <w:b w:val="false"/>
-                <w:bCs w:val="false"/>
-                <w:color w:val="000000"/>
-                <w:sz w:val="16"/>
-                <w:szCs w:val="16"/>
-              </w:rPr>
-              <w:t xml:space="preserve">greeting_then_hangup</w:t>
-            </w:r>
-          </w:p>
-        </w:tc>
-        <w:tc>
-          <w:tcPr>
-            <w:tcW w:type="dxa" w:w="1200"/>
-            <w:tcBorders>
-              <w:top w:val="single" w:color="CCCCCC" w:sz="1"/>
-              <w:left w:val="single" w:color="CCCCCC" w:sz="1"/>
-              <w:bottom w:val="single" w:color="CCCCCC" w:sz="1"/>
-              <w:right w:val="single" w:color="CCCCCC" w:sz="1"/>
-            </w:tcBorders>
-            <w:tcMar>
-              <w:top w:type="dxa" w:w="60"/>
-              <w:left w:type="dxa" w:w="100"/>
-              <w:bottom w:type="dxa" w:w="60"/>
-              <w:right w:type="dxa" w:w="100"/>
-            </w:tcMar>
-          </w:tcPr>
-          <w:p>
-            <w:pPr>
-              <w:jc w:val="center"/>
-            </w:pPr>
-            <w:r>
-              <w:rPr>
-                <w:rFonts w:ascii="Helvetica" w:cs="Helvetica" w:eastAsia="Helvetica" w:hAnsi="Helvetica"/>
-                <w:b w:val="false"/>
-                <w:bCs w:val="false"/>
-                <w:color w:val="000000"/>
-                <w:sz w:val="16"/>
-                <w:szCs w:val="16"/>
-              </w:rPr>
-              <w:t xml:space="preserve">87</w:t>
-            </w:r>
-          </w:p>
-        </w:tc>
-        <w:tc>
-          <w:tcPr>
-            <w:tcW w:type="dxa" w:w="1660"/>
-            <w:tcBorders>
-              <w:top w:val="single" w:color="CCCCCC" w:sz="1"/>
-              <w:left w:val="single" w:color="CCCCCC" w:sz="1"/>
-              <w:bottom w:val="single" w:color="CCCCCC" w:sz="1"/>
-              <w:right w:val="single" w:color="CCCCCC" w:sz="1"/>
-            </w:tcBorders>
-            <w:tcMar>
-              <w:top w:type="dxa" w:w="60"/>
-              <w:left w:type="dxa" w:w="100"/>
-              <w:bottom w:type="dxa" w:w="60"/>
-              <w:right w:type="dxa" w:w="100"/>
-            </w:tcMar>
-          </w:tcPr>
-          <w:p>
-            <w:pPr>
-              <w:jc w:val="center"/>
-            </w:pPr>
-            <w:r>
-              <w:rPr>
-                <w:rFonts w:ascii="Helvetica" w:cs="Helvetica" w:eastAsia="Helvetica" w:hAnsi="Helvetica"/>
-                <w:b w:val="false"/>
-                <w:bCs w:val="false"/>
-                <w:color w:val="000000"/>
-                <w:sz w:val="16"/>
-                <w:szCs w:val="16"/>
-              </w:rPr>
-              <w:t xml:space="preserve">47.3%</w:t>
-            </w:r>
-          </w:p>
-        </w:tc>
-        <w:tc>
-          <w:tcPr>
-            <w:tcW w:type="dxa" w:w="3000"/>
-            <w:tcBorders>
-              <w:top w:val="single" w:color="CCCCCC" w:sz="1"/>
-              <w:left w:val="single" w:color="CCCCCC" w:sz="1"/>
-              <w:bottom w:val="single" w:color="CCCCCC" w:sz="1"/>
-              <w:right w:val="single" w:color="CCCCCC" w:sz="1"/>
-            </w:tcBorders>
-            <w:tcMar>
-              <w:top w:type="dxa" w:w="60"/>
-              <w:left w:type="dxa" w:w="100"/>
-              <w:bottom w:type="dxa" w:w="60"/>
-              <w:right w:type="dxa" w:w="100"/>
-            </w:tcMar>
-          </w:tcPr>
-          <w:p>
-            <w:pPr>
-              <w:jc w:val="left"/>
-            </w:pPr>
-            <w:r>
-              <w:rPr>
-                <w:rFonts w:ascii="Helvetica" w:cs="Helvetica" w:eastAsia="Helvetica" w:hAnsi="Helvetica"/>
-                <w:b w:val="false"/>
-                <w:bCs w:val="false"/>
-                <w:color w:val="666666"/>
-                <w:sz w:val="16"/>
-                <w:szCs w:val="16"/>
-              </w:rPr>
-              <w:t xml:space="preserve">Agent opening needs faster hook</w:t>
-            </w:r>
-          </w:p>
-        </w:tc>
-      </w:tr>
-      <w:tr>
-        <w:tc>
-          <w:tcPr>
-            <w:tcW w:type="dxa" w:w="3500"/>
-            <w:tcBorders>
-              <w:top w:val="single" w:color="CCCCCC" w:sz="1"/>
-              <w:left w:val="single" w:color="CCCCCC" w:sz="1"/>
-              <w:bottom w:val="single" w:color="CCCCCC" w:sz="1"/>
-              <w:right w:val="single" w:color="CCCCCC" w:sz="1"/>
-            </w:tcBorders>
-            <w:tcMar>
-              <w:top w:type="dxa" w:w="60"/>
-              <w:left w:type="dxa" w:w="100"/>
-              <w:bottom w:type="dxa" w:w="60"/>
-              <w:right w:type="dxa" w:w="100"/>
-            </w:tcMar>
-          </w:tcPr>
-          <w:p>
-            <w:pPr>
-              <w:jc w:val="left"/>
-            </w:pPr>
-            <w:r>
-              <w:rPr>
-                <w:rFonts w:ascii="Helvetica" w:cs="Helvetica" w:eastAsia="Helvetica" w:hAnsi="Helvetica"/>
-                <w:b w:val="false"/>
-                <w:bCs w:val="false"/>
-                <w:color w:val="000000"/>
-                <w:sz w:val="16"/>
-                <w:szCs w:val="16"/>
-              </w:rPr>
-              <w:t xml:space="preserve">brief_exchange_unclear</w:t>
-            </w:r>
-          </w:p>
-        </w:tc>
-        <w:tc>
-          <w:tcPr>
-            <w:tcW w:type="dxa" w:w="1200"/>
-            <w:tcBorders>
-              <w:top w:val="single" w:color="CCCCCC" w:sz="1"/>
-              <w:left w:val="single" w:color="CCCCCC" w:sz="1"/>
-              <w:bottom w:val="single" w:color="CCCCCC" w:sz="1"/>
-              <w:right w:val="single" w:color="CCCCCC" w:sz="1"/>
-            </w:tcBorders>
-            <w:tcMar>
-              <w:top w:type="dxa" w:w="60"/>
-              <w:left w:type="dxa" w:w="100"/>
-              <w:bottom w:type="dxa" w:w="60"/>
-              <w:right w:type="dxa" w:w="100"/>
-            </w:tcMar>
-          </w:tcPr>
-          <w:p>
-            <w:pPr>
-              <w:jc w:val="center"/>
-            </w:pPr>
-            <w:r>
-              <w:rPr>
-                <w:rFonts w:ascii="Helvetica" w:cs="Helvetica" w:eastAsia="Helvetica" w:hAnsi="Helvetica"/>
-                <w:b w:val="false"/>
-                <w:bCs w:val="false"/>
-                <w:color w:val="000000"/>
-                <w:sz w:val="16"/>
-                <w:szCs w:val="16"/>
-              </w:rPr>
-              <w:t xml:space="preserve">58</w:t>
-            </w:r>
-          </w:p>
-        </w:tc>
-        <w:tc>
-          <w:tcPr>
-            <w:tcW w:type="dxa" w:w="1660"/>
-            <w:tcBorders>
-              <w:top w:val="single" w:color="CCCCCC" w:sz="1"/>
-              <w:left w:val="single" w:color="CCCCCC" w:sz="1"/>
-              <w:bottom w:val="single" w:color="CCCCCC" w:sz="1"/>
-              <w:right w:val="single" w:color="CCCCCC" w:sz="1"/>
-            </w:tcBorders>
-            <w:tcMar>
-              <w:top w:type="dxa" w:w="60"/>
-              <w:left w:type="dxa" w:w="100"/>
-              <w:bottom w:type="dxa" w:w="60"/>
-              <w:right w:type="dxa" w:w="100"/>
-            </w:tcMar>
-          </w:tcPr>
-          <w:p>
-            <w:pPr>
-              <w:jc w:val="center"/>
-            </w:pPr>
-            <w:r>
-              <w:rPr>
-                <w:rFonts w:ascii="Helvetica" w:cs="Helvetica" w:eastAsia="Helvetica" w:hAnsi="Helvetica"/>
-                <w:b w:val="false"/>
-                <w:bCs w:val="false"/>
-                <w:color w:val="000000"/>
-                <w:sz w:val="16"/>
-                <w:szCs w:val="16"/>
-              </w:rPr>
-              <w:t xml:space="preserve">31.5%</w:t>
-            </w:r>
-          </w:p>
-        </w:tc>
-        <w:tc>
-          <w:tcPr>
-            <w:tcW w:type="dxa" w:w="3000"/>
-            <w:tcBorders>
-              <w:top w:val="single" w:color="CCCCCC" w:sz="1"/>
-              <w:left w:val="single" w:color="CCCCCC" w:sz="1"/>
-              <w:bottom w:val="single" w:color="CCCCCC" w:sz="1"/>
-              <w:right w:val="single" w:color="CCCCCC" w:sz="1"/>
-            </w:tcBorders>
-            <w:tcMar>
-              <w:top w:type="dxa" w:w="60"/>
-              <w:left w:type="dxa" w:w="100"/>
-              <w:bottom w:type="dxa" w:w="60"/>
-              <w:right w:type="dxa" w:w="100"/>
-            </w:tcMar>
-          </w:tcPr>
-          <w:p>
-            <w:pPr>
-              <w:jc w:val="left"/>
-            </w:pPr>
-            <w:r>
-              <w:rPr>
-                <w:rFonts w:ascii="Helvetica" w:cs="Helvetica" w:eastAsia="Helvetica" w:hAnsi="Helvetica"/>
-                <w:b w:val="false"/>
-                <w:bCs w:val="false"/>
-                <w:color w:val="666666"/>
-                <w:sz w:val="16"/>
-                <w:szCs w:val="16"/>
-              </w:rPr>
-              <w:t xml:space="preserve">Needs transcript review</w:t>
-            </w:r>
-          </w:p>
-        </w:tc>
-      </w:tr>
-      <w:tr>
-        <w:tc>
-          <w:tcPr>
-            <w:tcW w:type="dxa" w:w="3500"/>
-            <w:tcBorders>
-              <w:top w:val="single" w:color="CCCCCC" w:sz="1"/>
-              <w:left w:val="single" w:color="CCCCCC" w:sz="1"/>
-              <w:bottom w:val="single" w:color="CCCCCC" w:sz="1"/>
-              <w:right w:val="single" w:color="CCCCCC" w:sz="1"/>
-            </w:tcBorders>
-            <w:tcMar>
-              <w:top w:type="dxa" w:w="60"/>
-              <w:left w:type="dxa" w:w="100"/>
-              <w:bottom w:type="dxa" w:w="60"/>
-              <w:right w:type="dxa" w:w="100"/>
-            </w:tcMar>
-          </w:tcPr>
-          <w:p>
-            <w:pPr>
-              <w:jc w:val="left"/>
-            </w:pPr>
-            <w:r>
-              <w:rPr>
-                <w:rFonts w:ascii="Helvetica" w:cs="Helvetica" w:eastAsia="Helvetica" w:hAnsi="Helvetica"/>
-                <w:b w:val="false"/>
-                <w:bCs w:val="false"/>
-                <w:color w:val="000000"/>
-                <w:sz w:val="16"/>
-                <w:szCs w:val="16"/>
-              </w:rPr>
-              <w:t xml:space="preserve">no_member_speech</w:t>
-            </w:r>
-          </w:p>
-        </w:tc>
-        <w:tc>
-          <w:tcPr>
-            <w:tcW w:type="dxa" w:w="1200"/>
-            <w:tcBorders>
-              <w:top w:val="single" w:color="CCCCCC" w:sz="1"/>
-              <w:left w:val="single" w:color="CCCCCC" w:sz="1"/>
-              <w:bottom w:val="single" w:color="CCCCCC" w:sz="1"/>
-              <w:right w:val="single" w:color="CCCCCC" w:sz="1"/>
-            </w:tcBorders>
-            <w:tcMar>
-              <w:top w:type="dxa" w:w="60"/>
-              <w:left w:type="dxa" w:w="100"/>
-              <w:bottom w:type="dxa" w:w="60"/>
-              <w:right w:type="dxa" w:w="100"/>
-            </w:tcMar>
-          </w:tcPr>
-          <w:p>
-            <w:pPr>
-              <w:jc w:val="center"/>
-            </w:pPr>
-            <w:r>
-              <w:rPr>
-                <w:rFonts w:ascii="Helvetica" w:cs="Helvetica" w:eastAsia="Helvetica" w:hAnsi="Helvetica"/>
-                <w:b w:val="false"/>
-                <w:bCs w:val="false"/>
-                <w:color w:val="000000"/>
-                <w:sz w:val="16"/>
-                <w:szCs w:val="16"/>
-              </w:rPr>
-              <w:t xml:space="preserve">39</w:t>
-            </w:r>
-          </w:p>
-        </w:tc>
-        <w:tc>
-          <w:tcPr>
-            <w:tcW w:type="dxa" w:w="1660"/>
-            <w:tcBorders>
-              <w:top w:val="single" w:color="CCCCCC" w:sz="1"/>
-              <w:left w:val="single" w:color="CCCCCC" w:sz="1"/>
-              <w:bottom w:val="single" w:color="CCCCCC" w:sz="1"/>
-              <w:right w:val="single" w:color="CCCCCC" w:sz="1"/>
-            </w:tcBorders>
-            <w:tcMar>
-              <w:top w:type="dxa" w:w="60"/>
-              <w:left w:type="dxa" w:w="100"/>
-              <w:bottom w:type="dxa" w:w="60"/>
-              <w:right w:type="dxa" w:w="100"/>
-            </w:tcMar>
-          </w:tcPr>
-          <w:p>
-            <w:pPr>
-              <w:jc w:val="center"/>
-            </w:pPr>
-            <w:r>
-              <w:rPr>
-                <w:rFonts w:ascii="Helvetica" w:cs="Helvetica" w:eastAsia="Helvetica" w:hAnsi="Helvetica"/>
-                <w:b w:val="false"/>
-                <w:bCs w:val="false"/>
-                <w:color w:val="000000"/>
-                <w:sz w:val="16"/>
-                <w:szCs w:val="16"/>
-              </w:rPr>
-              <w:t xml:space="preserve">21.2%</w:t>
-            </w:r>
-          </w:p>
-        </w:tc>
-        <w:tc>
-          <w:tcPr>
-            <w:tcW w:type="dxa" w:w="3000"/>
-            <w:tcBorders>
-              <w:top w:val="single" w:color="CCCCCC" w:sz="1"/>
-              <w:left w:val="single" w:color="CCCCCC" w:sz="1"/>
-              <w:bottom w:val="single" w:color="CCCCCC" w:sz="1"/>
-              <w:right w:val="single" w:color="CCCCCC" w:sz="1"/>
-            </w:tcBorders>
-            <w:tcMar>
-              <w:top w:type="dxa" w:w="60"/>
-              <w:left w:type="dxa" w:w="100"/>
-              <w:bottom w:type="dxa" w:w="60"/>
-              <w:right w:type="dxa" w:w="100"/>
-            </w:tcMar>
-          </w:tcPr>
-          <w:p>
-            <w:pPr>
-              <w:jc w:val="left"/>
-            </w:pPr>
-            <w:r>
-              <w:rPr>
-                <w:rFonts w:ascii="Helvetica" w:cs="Helvetica" w:eastAsia="Helvetica" w:hAnsi="Helvetica"/>
-                <w:b w:val="false"/>
-                <w:bCs w:val="false"/>
-                <w:color w:val="666666"/>
-                <w:sz w:val="16"/>
-                <w:szCs w:val="16"/>
-              </w:rPr>
-              <w:t xml:space="preserve">Pickup detection or instant hangup</w:t>
-            </w:r>
-          </w:p>
-        </w:tc>
-      </w:tr>
-    </w:tbl>
-    <w:p>
-      <w:r>
-        <w:br w:type="page"/>
-      </w:r>
-    </w:p>
-    <w:p>
-      <w:pPr>
-        <w:pStyle w:val="Heading1"/>
-      </w:pPr>
-      <w:r>
-        <w:rPr>
-          <w:rFonts w:ascii="Helvetica" w:cs="Helvetica" w:eastAsia="Helvetica" w:hAnsi="Helvetica"/>
-          <w:b/>
-          <w:bCs/>
-          <w:color w:val="1A1A2E"/>
-        </w:rPr>
-        <w:t xml:space="preserve">5. Technical Issues</w:t>
+        <w:t xml:space="preserve">5. Other Issues</w:t>
       </w:r>
     </w:p>
     <w:tbl>
@@ -7837,7 +7227,7 @@
                 <w:sz w:val="16"/>
                 <w:szCs w:val="16"/>
               </w:rPr>
-              <w:t xml:space="preserve">Severity</w:t>
+              <w:t xml:space="preserve">Priority</w:t>
             </w:r>
           </w:p>
         </w:tc>
@@ -7907,7 +7297,7 @@
                 <w:sz w:val="16"/>
                 <w:szCs w:val="16"/>
               </w:rPr>
-              <w:t xml:space="preserve">Double-pitch bug</w:t>
+              <w:t xml:space="preserve">VM “important message”</w:t>
             </w:r>
           </w:p>
         </w:tc>
@@ -7940,7 +7330,7 @@
                 <w:sz w:val="16"/>
                 <w:szCs w:val="16"/>
               </w:rPr>
-              <w:t xml:space="preserve">164</w:t>
+              <w:t xml:space="preserve">43</w:t>
             </w:r>
           </w:p>
         </w:tc>
@@ -7973,7 +7363,7 @@
                 <w:sz w:val="16"/>
                 <w:szCs w:val="16"/>
               </w:rPr>
-              <w:t xml:space="preserve">68.3% spoke</w:t>
+              <w:t xml:space="preserve">12.8% of VMs</w:t>
             </w:r>
           </w:p>
         </w:tc>
@@ -8002,11 +7392,11 @@
                 <w:rFonts w:ascii="Helvetica" w:cs="Helvetica" w:eastAsia="Helvetica" w:hAnsi="Helvetica"/>
                 <w:b/>
                 <w:bCs/>
-                <w:color w:val="CC0000"/>
-                <w:sz w:val="16"/>
-                <w:szCs w:val="16"/>
-              </w:rPr>
-              <w:t xml:space="preserve">HIGH</w:t>
+                <w:color w:val="666666"/>
+                <w:sz w:val="16"/>
+                <w:szCs w:val="16"/>
+              </w:rPr>
+              <w:t xml:space="preserve">MEDIUM</w:t>
             </w:r>
           </w:p>
         </w:tc>
@@ -8039,7 +7429,7 @@
                 <w:sz w:val="16"/>
                 <w:szCs w:val="16"/>
               </w:rPr>
-              <w:t xml:space="preserve">Opening pitch repeated after disclaimer</w:t>
+              <w:t xml:space="preserve">Carrier screening triggers a spammy-sounding fallback</w:t>
             </w:r>
           </w:p>
         </w:tc>
@@ -8074,7 +7464,7 @@
                 <w:sz w:val="16"/>
                 <w:szCs w:val="16"/>
               </w:rPr>
-              <w:t xml:space="preserve">VM fallback</w:t>
+              <w:t xml:space="preserve">Narrow call window</w:t>
             </w:r>
           </w:p>
         </w:tc>
@@ -8107,7 +7497,7 @@
                 <w:sz w:val="16"/>
                 <w:szCs w:val="16"/>
               </w:rPr>
-              <w:t xml:space="preserve">43</w:t>
+              <w:t xml:space="preserve">561</w:t>
             </w:r>
           </w:p>
         </w:tc>
@@ -8140,7 +7530,7 @@
                 <w:sz w:val="16"/>
                 <w:szCs w:val="16"/>
               </w:rPr>
-              <w:t xml:space="preserve">12.8% VM</w:t>
+              <w:t xml:space="preserve">91.5% in 1hr</w:t>
             </w:r>
           </w:p>
         </w:tc>
@@ -8173,7 +7563,7 @@
                 <w:sz w:val="16"/>
                 <w:szCs w:val="16"/>
               </w:rPr>
-              <w:t xml:space="preserve">MEDIUM</w:t>
+              <w:t xml:space="preserve">LOW</w:t>
             </w:r>
           </w:p>
         </w:tc>
@@ -8206,174 +7596,7 @@
                 <w:sz w:val="16"/>
                 <w:szCs w:val="16"/>
               </w:rPr>
-              <w:t xml:space="preserve">Carrier screening triggers “important message”</w:t>
-            </w:r>
-          </w:p>
-        </w:tc>
-      </w:tr>
-      <w:tr>
-        <w:tc>
-          <w:tcPr>
-            <w:tcW w:type="dxa" w:w="2600"/>
-            <w:tcBorders>
-              <w:top w:val="single" w:color="CCCCCC" w:sz="1"/>
-              <w:left w:val="single" w:color="CCCCCC" w:sz="1"/>
-              <w:bottom w:val="single" w:color="CCCCCC" w:sz="1"/>
-              <w:right w:val="single" w:color="CCCCCC" w:sz="1"/>
-            </w:tcBorders>
-            <w:tcMar>
-              <w:top w:type="dxa" w:w="60"/>
-              <w:left w:type="dxa" w:w="100"/>
-              <w:bottom w:type="dxa" w:w="60"/>
-              <w:right w:type="dxa" w:w="100"/>
-            </w:tcMar>
-          </w:tcPr>
-          <w:p>
-            <w:pPr>
-              <w:jc w:val="left"/>
-            </w:pPr>
-            <w:r>
-              <w:rPr>
-                <w:rFonts w:ascii="Helvetica" w:cs="Helvetica" w:eastAsia="Helvetica" w:hAnsi="Helvetica"/>
-                <w:b/>
-                <w:bCs/>
-                <w:color w:val="000000"/>
-                <w:sz w:val="16"/>
-                <w:szCs w:val="16"/>
-              </w:rPr>
-              <w:t xml:space="preserve">Narrow call window</w:t>
-            </w:r>
-          </w:p>
-        </w:tc>
-        <w:tc>
-          <w:tcPr>
-            <w:tcW w:type="dxa" w:w="1200"/>
-            <w:tcBorders>
-              <w:top w:val="single" w:color="CCCCCC" w:sz="1"/>
-              <w:left w:val="single" w:color="CCCCCC" w:sz="1"/>
-              <w:bottom w:val="single" w:color="CCCCCC" w:sz="1"/>
-              <w:right w:val="single" w:color="CCCCCC" w:sz="1"/>
-            </w:tcBorders>
-            <w:tcMar>
-              <w:top w:type="dxa" w:w="60"/>
-              <w:left w:type="dxa" w:w="100"/>
-              <w:bottom w:type="dxa" w:w="60"/>
-              <w:right w:type="dxa" w:w="100"/>
-            </w:tcMar>
-          </w:tcPr>
-          <w:p>
-            <w:pPr>
-              <w:jc w:val="center"/>
-            </w:pPr>
-            <w:r>
-              <w:rPr>
-                <w:rFonts w:ascii="Helvetica" w:cs="Helvetica" w:eastAsia="Helvetica" w:hAnsi="Helvetica"/>
-                <w:b w:val="false"/>
-                <w:bCs w:val="false"/>
-                <w:color w:val="000000"/>
-                <w:sz w:val="16"/>
-                <w:szCs w:val="16"/>
-              </w:rPr>
-              <w:t xml:space="preserve">561</w:t>
-            </w:r>
-          </w:p>
-        </w:tc>
-        <w:tc>
-          <w:tcPr>
-            <w:tcW w:type="dxa" w:w="1560"/>
-            <w:tcBorders>
-              <w:top w:val="single" w:color="CCCCCC" w:sz="1"/>
-              <w:left w:val="single" w:color="CCCCCC" w:sz="1"/>
-              <w:bottom w:val="single" w:color="CCCCCC" w:sz="1"/>
-              <w:right w:val="single" w:color="CCCCCC" w:sz="1"/>
-            </w:tcBorders>
-            <w:tcMar>
-              <w:top w:type="dxa" w:w="60"/>
-              <w:left w:type="dxa" w:w="100"/>
-              <w:bottom w:type="dxa" w:w="60"/>
-              <w:right w:type="dxa" w:w="100"/>
-            </w:tcMar>
-          </w:tcPr>
-          <w:p>
-            <w:pPr>
-              <w:jc w:val="center"/>
-            </w:pPr>
-            <w:r>
-              <w:rPr>
-                <w:rFonts w:ascii="Helvetica" w:cs="Helvetica" w:eastAsia="Helvetica" w:hAnsi="Helvetica"/>
-                <w:b w:val="false"/>
-                <w:bCs w:val="false"/>
-                <w:color w:val="000000"/>
-                <w:sz w:val="16"/>
-                <w:szCs w:val="16"/>
-              </w:rPr>
-              <w:t xml:space="preserve">91.5% in 1hr</w:t>
-            </w:r>
-          </w:p>
-        </w:tc>
-        <w:tc>
-          <w:tcPr>
-            <w:tcW w:type="dxa" w:w="1000"/>
-            <w:tcBorders>
-              <w:top w:val="single" w:color="CCCCCC" w:sz="1"/>
-              <w:left w:val="single" w:color="CCCCCC" w:sz="1"/>
-              <w:bottom w:val="single" w:color="CCCCCC" w:sz="1"/>
-              <w:right w:val="single" w:color="CCCCCC" w:sz="1"/>
-            </w:tcBorders>
-            <w:tcMar>
-              <w:top w:type="dxa" w:w="60"/>
-              <w:left w:type="dxa" w:w="100"/>
-              <w:bottom w:type="dxa" w:w="60"/>
-              <w:right w:type="dxa" w:w="100"/>
-            </w:tcMar>
-          </w:tcPr>
-          <w:p>
-            <w:pPr>
-              <w:jc w:val="center"/>
-            </w:pPr>
-            <w:r>
-              <w:rPr>
-                <w:rFonts w:ascii="Helvetica" w:cs="Helvetica" w:eastAsia="Helvetica" w:hAnsi="Helvetica"/>
-                <w:b/>
-                <w:bCs/>
-                <w:color w:val="666666"/>
-                <w:sz w:val="16"/>
-                <w:szCs w:val="16"/>
-              </w:rPr>
-              <w:t xml:space="preserve">LOW</w:t>
-            </w:r>
-          </w:p>
-        </w:tc>
-        <w:tc>
-          <w:tcPr>
-            <w:tcW w:type="dxa" w:w="3000"/>
-            <w:tcBorders>
-              <w:top w:val="single" w:color="CCCCCC" w:sz="1"/>
-              <w:left w:val="single" w:color="CCCCCC" w:sz="1"/>
-              <w:bottom w:val="single" w:color="CCCCCC" w:sz="1"/>
-              <w:right w:val="single" w:color="CCCCCC" w:sz="1"/>
-            </w:tcBorders>
-            <w:tcMar>
-              <w:top w:type="dxa" w:w="60"/>
-              <w:left w:type="dxa" w:w="100"/>
-              <w:bottom w:type="dxa" w:w="60"/>
-              <w:right w:type="dxa" w:w="100"/>
-            </w:tcMar>
-          </w:tcPr>
-          <w:p>
-            <w:pPr>
-              <w:jc w:val="left"/>
-            </w:pPr>
-            <w:r>
-              <w:rPr>
-                <w:rFonts w:ascii="Helvetica" w:cs="Helvetica" w:eastAsia="Helvetica" w:hAnsi="Helvetica"/>
-                <w:b w:val="false"/>
-                <w:bCs w:val="false"/>
-                <w:color w:val="000000"/>
-                <w:sz w:val="16"/>
-                <w:szCs w:val="16"/>
-              </w:rPr>
-              <w:t xml:space="preserve">91.5% of calls in 19:00 UTC hour</w:t>
+              <w:t xml:space="preserve">Almost all calls at 12–1pm PT. TZ scheduling due Apr 17.</w:t>
             </w:r>
           </w:p>
         </w:tc>
@@ -8397,7 +7620,42 @@
           <w:sz w:val="18"/>
           <w:szCs w:val="18"/>
         </w:rPr>
-        <w:t xml:space="preserve">VM fallback root cause: 39/43 (90.7%) triggered by the same carrier screening prompt: “Hi. If you record your name and reason for calling, I’ll see if this person is available.” This is a carrier-level call screener, not a voicemail. The agent hears it and plays the “important message” fallback instead of a branded greeting.</w:t>
+        <w:t xml:space="preserve">VM fallback: 91% of these are triggered by the same carrier screening prompt (“If you record your name...”). The agent hears it and plays a generic “I have an important message” line instead of its normal branded greeting.</w:t>
+      </w:r>
+    </w:p>
+    <w:p>
+      <w:pPr>
+        <w:spacing w:after="80" w:before="80"/>
+      </w:pPr>
+    </w:p>
+    <w:p>
+      <w:pPr>
+        <w:pStyle w:val="Heading3"/>
+      </w:pPr>
+      <w:r>
+        <w:rPr>
+          <w:rFonts w:ascii="Helvetica" w:cs="Helvetica" w:eastAsia="Helvetica" w:hAnsi="Helvetica"/>
+          <w:b/>
+          <w:bCs/>
+          <w:color w:val="1A1A2E"/>
+        </w:rPr>
+        <w:t xml:space="preserve">Correction from v1</w:t>
+      </w:r>
+    </w:p>
+    <w:p>
+      <w:pPr>
+        <w:spacing w:after="100"/>
+      </w:pPr>
+      <w:r>
+        <w:rPr>
+          <w:rFonts w:ascii="Helvetica" w:cs="Helvetica" w:eastAsia="Helvetica" w:hAnsi="Helvetica"/>
+          <w:b w:val="false"/>
+          <w:bCs w:val="false"/>
+          <w:color w:val="666666"/>
+          <w:sz w:val="18"/>
+          <w:szCs w:val="18"/>
+        </w:rPr>
+        <w:t xml:space="preserve">The April 14 draft flagged a “double-pitch bug” affecting 68% of calls. Turned out to be a recording artifact — the transcript logs the opening twice, but the member only hears it once. Removed from this version. The quality gap is structural (opening sequence), not a specific bug.</w:t>
       </w:r>
     </w:p>
     <w:p>
@@ -8416,7 +7674,7 @@
           <w:bCs/>
           <w:color w:val="1A1A2E"/>
         </w:rPr>
-        <w:t xml:space="preserve">6. Prioritized Fixes</w:t>
+        <w:t xml:space="preserve">6. What to Ship</w:t>
       </w:r>
     </w:p>
     <w:p>
@@ -8432,7 +7690,7 @@
           <w:sz w:val="18"/>
           <w:szCs w:val="18"/>
         </w:rPr>
-        <w:t xml:space="preserve">Ranked by number of calls affected. All counts derived from the analysis pipeline.</w:t>
+        <w:t xml:space="preserve">Ordered by expected impact.</w:t>
       </w:r>
     </w:p>
     <w:p>
@@ -8454,9 +7712,9 @@
       </w:tblPr>
       <w:tblGrid>
         <w:gridCol w:w="500"/>
-        <w:gridCol w:w="3800"/>
+        <w:gridCol w:w="4200"/>
         <w:gridCol w:w="1260"/>
-        <w:gridCol w:w="3800"/>
+        <w:gridCol w:w="3400"/>
       </w:tblGrid>
       <w:tr>
         <w:tc>
@@ -8496,7 +7754,7 @@
         </w:tc>
         <w:tc>
           <w:tcPr>
-            <w:tcW w:type="dxa" w:w="3800"/>
+            <w:tcW w:type="dxa" w:w="4200"/>
             <w:tcBorders>
               <w:top w:val="single" w:color="CCCCCC" w:sz="1"/>
               <w:left w:val="single" w:color="CCCCCC" w:sz="1"/>
@@ -8525,7 +7783,7 @@
                 <w:sz w:val="16"/>
                 <w:szCs w:val="16"/>
               </w:rPr>
-              <w:t xml:space="preserve">Fix</w:t>
+              <w:t xml:space="preserve">Change</w:t>
             </w:r>
           </w:p>
         </w:tc>
@@ -8560,13 +7818,13 @@
                 <w:sz w:val="16"/>
                 <w:szCs w:val="16"/>
               </w:rPr>
-              <w:t xml:space="preserve">Affected</w:t>
-            </w:r>
-          </w:p>
-        </w:tc>
-        <w:tc>
-          <w:tcPr>
-            <w:tcW w:type="dxa" w:w="3800"/>
+              <w:t xml:space="preserve">Impact</w:t>
+            </w:r>
+          </w:p>
+        </w:tc>
+        <w:tc>
+          <w:tcPr>
+            <w:tcW w:type="dxa" w:w="3400"/>
             <w:tcBorders>
               <w:top w:val="single" w:color="CCCCCC" w:sz="1"/>
               <w:left w:val="single" w:color="CCCCCC" w:sz="1"/>
@@ -8595,7 +7853,7 @@
                 <w:sz w:val="16"/>
                 <w:szCs w:val="16"/>
               </w:rPr>
-              <w:t xml:space="preserve">Evidence</w:t>
+              <w:t xml:space="preserve">Why</w:t>
             </w:r>
           </w:p>
         </w:tc>
@@ -8637,7 +7895,7 @@
         </w:tc>
         <w:tc>
           <w:tcPr>
-            <w:tcW w:type="dxa" w:w="3800"/>
+            <w:tcW w:type="dxa" w:w="4200"/>
             <w:tcBorders>
               <w:top w:val="single" w:color="CCCCCC" w:sz="1"/>
               <w:left w:val="single" w:color="CCCCCC" w:sz="1"/>
@@ -8664,7 +7922,7 @@
                 <w:sz w:val="16"/>
                 <w:szCs w:val="16"/>
               </w:rPr>
-              <w:t xml:space="preserve">Send SMS booking link proactively during spoke_to calls</w:t>
+              <w:t xml:space="preserve">Restructure opening: greeting → disclaimer → pitch</w:t>
             </w:r>
           </w:p>
         </w:tc>
@@ -8697,13 +7955,13 @@
                 <w:sz w:val="16"/>
                 <w:szCs w:val="16"/>
               </w:rPr>
-              <w:t xml:space="preserve">236</w:t>
-            </w:r>
-          </w:p>
-        </w:tc>
-        <w:tc>
-          <w:tcPr>
-            <w:tcW w:type="dxa" w:w="3800"/>
+              <w:t xml:space="preserve">HIGH</w:t>
+            </w:r>
+          </w:p>
+        </w:tc>
+        <w:tc>
+          <w:tcPr>
+            <w:tcW w:type="dxa" w:w="3400"/>
             <w:tcBorders>
               <w:top w:val="single" w:color="CCCCCC" w:sz="1"/>
               <w:left w:val="single" w:color="CCCCCC" w:sz="1"/>
@@ -8730,7 +7988,7 @@
                 <w:sz w:val="16"/>
                 <w:szCs w:val="16"/>
               </w:rPr>
-              <w:t xml:space="preserve">Only 4/240 calls sent an SMS link</w:t>
+              <w:t xml:space="preserve">Screened calls are 7x more successful. Just reorder the existing sequence.</w:t>
             </w:r>
           </w:p>
         </w:tc>
@@ -8772,7 +8030,7 @@
         </w:tc>
         <w:tc>
           <w:tcPr>
-            <w:tcW w:type="dxa" w:w="3800"/>
+            <w:tcW w:type="dxa" w:w="4200"/>
             <w:tcBorders>
               <w:top w:val="single" w:color="CCCCCC" w:sz="1"/>
               <w:left w:val="single" w:color="CCCCCC" w:sz="1"/>
@@ -8799,7 +8057,7 @@
                 <w:sz w:val="16"/>
                 <w:szCs w:val="16"/>
               </w:rPr>
-              <w:t xml:space="preserve">Restructure opening: disclaimer → greeting → pitch</w:t>
+              <w:t xml:space="preserve">Send SMS booking link on every connected call</w:t>
             </w:r>
           </w:p>
         </w:tc>
@@ -8832,13 +8090,13 @@
                 <w:sz w:val="16"/>
                 <w:szCs w:val="16"/>
               </w:rPr>
-              <w:t xml:space="preserve">91</w:t>
-            </w:r>
-          </w:p>
-        </w:tc>
-        <w:tc>
-          <w:tcPr>
-            <w:tcW w:type="dxa" w:w="3800"/>
+              <w:t xml:space="preserve">HIGH</w:t>
+            </w:r>
+          </w:p>
+        </w:tc>
+        <w:tc>
+          <w:tcPr>
+            <w:tcW w:type="dxa" w:w="3400"/>
             <w:tcBorders>
               <w:top w:val="single" w:color="CCCCCC" w:sz="1"/>
               <w:left w:val="single" w:color="CCCCCC" w:sz="1"/>
@@ -8865,7 +8123,7 @@
                 <w:sz w:val="16"/>
                 <w:szCs w:val="16"/>
               </w:rPr>
-              <w:t xml:space="preserve">91 calls where pitch plays twice</w:t>
+              <w:t xml:space="preserve">Only 4 of 240 calls sent a link. If member shows any interest, text them immediately.</w:t>
             </w:r>
           </w:p>
         </w:tc>
@@ -8906,7 +8164,7 @@
         </w:tc>
         <w:tc>
           <w:tcPr>
-            <w:tcW w:type="dxa" w:w="3800"/>
+            <w:tcW w:type="dxa" w:w="4200"/>
             <w:tcBorders>
               <w:top w:val="single" w:color="CCCCCC" w:sz="1"/>
               <w:left w:val="single" w:color="CCCCCC" w:sz="1"/>
@@ -8933,7 +8191,7 @@
                 <w:sz w:val="16"/>
                 <w:szCs w:val="16"/>
               </w:rPr>
-              <w:t xml:space="preserve">After “Hello?”, greet first — not disclaimer</w:t>
+              <w:t xml:space="preserve">After member says “Hello?”, greet them first</w:t>
             </w:r>
           </w:p>
         </w:tc>
@@ -8962,17 +8220,17 @@
                 <w:rFonts w:ascii="Helvetica" w:cs="Helvetica" w:eastAsia="Helvetica" w:hAnsi="Helvetica"/>
                 <w:b/>
                 <w:bCs/>
-                <w:color w:val="CC0000"/>
-                <w:sz w:val="16"/>
-                <w:szCs w:val="16"/>
-              </w:rPr>
-              <w:t xml:space="preserve">84</w:t>
-            </w:r>
-          </w:p>
-        </w:tc>
-        <w:tc>
-          <w:tcPr>
-            <w:tcW w:type="dxa" w:w="3800"/>
+                <w:color w:val="666666"/>
+                <w:sz w:val="16"/>
+                <w:szCs w:val="16"/>
+              </w:rPr>
+              <w:t xml:space="preserve">MEDIUM</w:t>
+            </w:r>
+          </w:p>
+        </w:tc>
+        <w:tc>
+          <w:tcPr>
+            <w:tcW w:type="dxa" w:w="3400"/>
             <w:tcBorders>
               <w:top w:val="single" w:color="CCCCCC" w:sz="1"/>
               <w:left w:val="single" w:color="CCCCCC" w:sz="1"/>
@@ -8999,7 +8257,7 @@
                 <w:sz w:val="16"/>
                 <w:szCs w:val="16"/>
               </w:rPr>
-              <w:t xml:space="preserve">84 calls go Hello? → disclaimer</w:t>
+              <w:t xml:space="preserve">84 calls went Hello? → disclaimer. Should be Hello? → “Hey, it’s Jade from UFC Gym”</w:t>
             </w:r>
           </w:p>
         </w:tc>
@@ -9040,7 +8298,7 @@
         </w:tc>
         <w:tc>
           <w:tcPr>
-            <w:tcW w:type="dxa" w:w="3800"/>
+            <w:tcW w:type="dxa" w:w="4200"/>
             <w:tcBorders>
               <w:top w:val="single" w:color="CCCCCC" w:sz="1"/>
               <w:left w:val="single" w:color="CCCCCC" w:sz="1"/>
@@ -9067,7 +8325,7 @@
                 <w:sz w:val="16"/>
                 <w:szCs w:val="16"/>
               </w:rPr>
-              <w:t xml:space="preserve">Replace “important message” fallback</w:t>
+              <w:t xml:space="preserve">Replace “important message” VM fallback</w:t>
             </w:r>
           </w:p>
         </w:tc>
@@ -9096,17 +8354,17 @@
                 <w:rFonts w:ascii="Helvetica" w:cs="Helvetica" w:eastAsia="Helvetica" w:hAnsi="Helvetica"/>
                 <w:b/>
                 <w:bCs/>
-                <w:color w:val="CC0000"/>
-                <w:sz w:val="16"/>
-                <w:szCs w:val="16"/>
-              </w:rPr>
-              <w:t xml:space="preserve">43+78</w:t>
-            </w:r>
-          </w:p>
-        </w:tc>
-        <w:tc>
-          <w:tcPr>
-            <w:tcW w:type="dxa" w:w="3800"/>
+                <w:color w:val="666666"/>
+                <w:sz w:val="16"/>
+                <w:szCs w:val="16"/>
+              </w:rPr>
+              <w:t xml:space="preserve">MEDIUM</w:t>
+            </w:r>
+          </w:p>
+        </w:tc>
+        <w:tc>
+          <w:tcPr>
+            <w:tcW w:type="dxa" w:w="3400"/>
             <w:tcBorders>
               <w:top w:val="single" w:color="CCCCCC" w:sz="1"/>
               <w:left w:val="single" w:color="CCCCCC" w:sz="1"/>
@@ -9133,12 +8391,194 @@
                 <w:sz w:val="16"/>
                 <w:szCs w:val="16"/>
               </w:rPr>
-              <w:t xml:space="preserve">43 VMs + 78 spoke_to calls affected</w:t>
+              <w:t xml:space="preserve">Swap the generic line for a branded voicemail intro.</w:t>
             </w:r>
           </w:p>
         </w:tc>
       </w:tr>
     </w:tbl>
+    <w:p>
+      <w:pPr>
+        <w:spacing w:after="80" w:before="80"/>
+      </w:pPr>
+    </w:p>
+    <w:p>
+      <w:pPr>
+        <w:pStyle w:val="Heading3"/>
+      </w:pPr>
+      <w:r>
+        <w:rPr>
+          <w:rFonts w:ascii="Helvetica" w:cs="Helvetica" w:eastAsia="Helvetica" w:hAnsi="Helvetica"/>
+          <w:b/>
+          <w:bCs/>
+          <w:color w:val="1A1A2E"/>
+        </w:rPr>
+        <w:t xml:space="preserve">What’s Working (Keep Doing)</w:t>
+      </w:r>
+    </w:p>
+    <w:p>
+      <w:pPr>
+        <w:spacing w:after="100"/>
+      </w:pPr>
+      <w:r>
+        <w:rPr>
+          <w:rFonts w:ascii="Helvetica" w:cs="Helvetica" w:eastAsia="Helvetica" w:hAnsi="Helvetica"/>
+          <w:b w:val="false"/>
+          <w:bCs w:val="false"/>
+          <w:color w:val="000000"/>
+          <w:sz w:val="18"/>
+          <w:szCs w:val="18"/>
+        </w:rPr>
+        <w:t xml:space="preserve">•  39.2% pickup rate — top-tier for warm outbound. Platform scales.</w:t>
+      </w:r>
+    </w:p>
+    <w:p>
+      <w:pPr>
+        <w:spacing w:after="100"/>
+      </w:pPr>
+      <w:r>
+        <w:rPr>
+          <w:rFonts w:ascii="Helvetica" w:cs="Helvetica" w:eastAsia="Helvetica" w:hAnsi="Helvetica"/>
+          <w:b w:val="false"/>
+          <w:bCs w:val="false"/>
+          <w:color w:val="000000"/>
+          <w:sz w:val="18"/>
+          <w:szCs w:val="18"/>
+        </w:rPr>
+        <w:t xml:space="preserve">•  10 locations, zero failures. New locations match original pilots without tuning.</w:t>
+      </w:r>
+    </w:p>
+    <w:p>
+      <w:pPr>
+        <w:spacing w:after="100"/>
+      </w:pPr>
+      <w:r>
+        <w:rPr>
+          <w:rFonts w:ascii="Helvetica" w:cs="Helvetica" w:eastAsia="Helvetica" w:hAnsi="Helvetica"/>
+          <w:b w:val="false"/>
+          <w:bCs w:val="false"/>
+          <w:color w:val="000000"/>
+          <w:sz w:val="18"/>
+          <w:szCs w:val="18"/>
+        </w:rPr>
+        <w:t xml:space="preserve">•  0.5% opt-out. Members aren’t hostile to the outreach.</w:t>
+      </w:r>
+    </w:p>
+    <w:p>
+      <w:pPr>
+        <w:spacing w:after="100"/>
+      </w:pPr>
+      <w:r>
+        <w:rPr>
+          <w:rFonts w:ascii="Helvetica" w:cs="Helvetica" w:eastAsia="Helvetica" w:hAnsi="Helvetica"/>
+          <w:b w:val="false"/>
+          <w:bCs w:val="false"/>
+          <w:color w:val="000000"/>
+          <w:sz w:val="18"/>
+          <w:szCs w:val="18"/>
+        </w:rPr>
+        <w:t xml:space="preserve">•  Voicemails are on-brand with recovery services pitch.</w:t>
+      </w:r>
+    </w:p>
+    <w:p>
+      <w:pPr>
+        <w:spacing w:after="100"/>
+      </w:pPr>
+      <w:r>
+        <w:rPr>
+          <w:rFonts w:ascii="Helvetica" w:cs="Helvetica" w:eastAsia="Helvetica" w:hAnsi="Helvetica"/>
+          <w:b w:val="false"/>
+          <w:bCs w:val="false"/>
+          <w:color w:val="000000"/>
+          <w:sz w:val="18"/>
+          <w:szCs w:val="18"/>
+        </w:rPr>
+        <w:t xml:space="preserve">•  Agent handles “not interested” gracefully, no pushback.</w:t>
+      </w:r>
+    </w:p>
+    <w:p>
+      <w:pPr>
+        <w:spacing w:after="80" w:before="80"/>
+      </w:pPr>
+    </w:p>
+    <w:p>
+      <w:pPr>
+        <w:pStyle w:val="Heading3"/>
+      </w:pPr>
+      <w:r>
+        <w:rPr>
+          <w:rFonts w:ascii="Helvetica" w:cs="Helvetica" w:eastAsia="Helvetica" w:hAnsi="Helvetica"/>
+          <w:b/>
+          <w:bCs/>
+          <w:color w:val="1A1A2E"/>
+        </w:rPr>
+        <w:t xml:space="preserve">Open Questions</w:t>
+      </w:r>
+    </w:p>
+    <w:p>
+      <w:pPr>
+        <w:spacing w:after="100"/>
+      </w:pPr>
+      <w:r>
+        <w:rPr>
+          <w:rFonts w:ascii="Helvetica" w:cs="Helvetica" w:eastAsia="Helvetica" w:hAnsi="Helvetica"/>
+          <w:b w:val="false"/>
+          <w:bCs w:val="false"/>
+          <w:color w:val="000000"/>
+          <w:sz w:val="18"/>
+          <w:szCs w:val="18"/>
+        </w:rPr>
+        <w:t xml:space="preserve">•  Apr 12 attrition results — where are they? We need retention numbers to tell the ROI story.</w:t>
+      </w:r>
+    </w:p>
+    <w:p>
+      <w:pPr>
+        <w:spacing w:after="100"/>
+      </w:pPr>
+      <w:r>
+        <w:rPr>
+          <w:rFonts w:ascii="Helvetica" w:cs="Helvetica" w:eastAsia="Helvetica" w:hAnsi="Helvetica"/>
+          <w:b w:val="false"/>
+          <w:bCs w:val="false"/>
+          <w:color w:val="000000"/>
+          <w:sz w:val="18"/>
+          <w:szCs w:val="18"/>
+        </w:rPr>
+        <w:t xml:space="preserve">•  Are recovery services the right campaign topic? Zero follow-up questions is a bad sign.</w:t>
+      </w:r>
+    </w:p>
+    <w:p>
+      <w:pPr>
+        <w:spacing w:after="100"/>
+      </w:pPr>
+      <w:r>
+        <w:rPr>
+          <w:rFonts w:ascii="Helvetica" w:cs="Helvetica" w:eastAsia="Helvetica" w:hAnsi="Helvetica"/>
+          <w:b w:val="false"/>
+          <w:bCs w:val="false"/>
+          <w:color w:val="000000"/>
+          <w:sz w:val="18"/>
+          <w:szCs w:val="18"/>
+        </w:rPr>
+        <w:t xml:space="preserve">•  We still can’t track called → booked → showed. GymSales integration needed.</w:t>
+      </w:r>
+    </w:p>
+    <w:p>
+      <w:pPr>
+        <w:spacing w:after="100"/>
+      </w:pPr>
+      <w:r>
+        <w:rPr>
+          <w:rFonts w:ascii="Helvetica" w:cs="Helvetica" w:eastAsia="Helvetica" w:hAnsi="Helvetica"/>
+          <w:b w:val="false"/>
+          <w:bCs w:val="false"/>
+          <w:color w:val="000000"/>
+          <w:sz w:val="18"/>
+          <w:szCs w:val="18"/>
+        </w:rPr>
+        <w:t xml:space="preserve">•  SMS data missing from Apr 13 export. Need to pull for full picture.</w:t>
+      </w:r>
+    </w:p>
     <w:p>
       <w:pPr>
         <w:spacing w:after="80" w:before="80"/>
@@ -9165,7 +8605,7 @@
           <w:sz w:val="16"/>
           <w:szCs w:val="16"/>
         </w:rPr>
-        <w:t xml:space="preserve">Methodology: </w:t>
+        <w:t xml:space="preserve">How this was built: </w:t>
       </w:r>
       <w:r>
         <w:rPr>
@@ -9174,7 +8614,7 @@
           <w:sz w:val="16"/>
           <w:szCs w:val="16"/>
         </w:rPr>
-        <w:t xml:space="preserve">Rule-based dialog act classifier (DAMSL/ISO 24617-2 inspired) applied to 4,039 message rows across 613 threads. Approach draws on TD-EVAL (Acikgoz et al. 2025) for turn-level error detection and BETOLD (Terragni et al. 2022) for breakdown classification. Every count is exact string matching on raw transcript data. Full analysis reproducible via: </w:t>
+        <w:t xml:space="preserve">Every message in every call thread was tagged by type (pitch, greeting, disclaimer, question, etc.) and the sequence of tags was compared between successful and failed calls. The call screening finding was tested statistically to confirm it’s real, not a fluke. All counts come from exact pattern matching on raw transcripts — no AI, no estimation. Reproducible via: </w:t>
       </w:r>
       <w:r>
         <w:rPr>

</xml_diff>